<commit_message>
docs: How we did it, layout and prose pass
Diagrams redrawn at printed width and cropped to content; subtitles centred in boxes; arrows and gaps fixed; figures placed so no page strands; prompt blocks as padded shaded cells; prose edited for plain human register, no em dashes, contrast tics removed; verbatim prompts untouched.

Co-Authored-By: Claude Fable 5.1 <noreply@anthropic.com>
</commit_message>
<xml_diff>
--- a/docs/how_we_did_it/NEEDLE_How_We_Did_It.docx
+++ b/docs/how_we_did_it/NEEDLE_How_We_Did_It.docx
@@ -80,7 +80,7 @@
           <w:sz w:val="21"/>
           <w:szCs w:val="21"/>
         </w:rPr>
-        <w:t xml:space="preserve">Over thirty hours we built NEEDLE, a system that finds material, non-obvious facts in pharmaceutical filings and turns them into one defensible CEO decision. It reads ten companies blind, argues every candidate finding between two skeptics who assume it is wrong, seals its company pick with a hash before anyone can influence it, and refuses to display any number it cannot trace to a page a judge can open.</w:t>
+        <w:t xml:space="preserve">Over thirty hours we built NEEDLE, a system that finds material, non-obvious facts in pharmaceutical filings and turns them into one defensible CEO decision. It reads ten companies blind. Two skeptics who assume each candidate finding is wrong argue over it. The company pick is sealed with a hash before anyone can influence it, and no number reaches the screen unless it traces to a page a judge can open.</w:t>
       </w:r>
     </w:p>
     <w:p>
@@ -108,12 +108,12 @@
           <w:sz w:val="21"/>
           <w:szCs w:val="21"/>
         </w:rPr>
-        <w:t xml:space="preserve">This report covers the tools we used and what each was for, how documents reached the AI and how the work was split between people and tools, the prompts that mattered most, the cases where the AI was confidently wrong, and what we would do differently. We logged 542 of those wrong cases. The ones that taught us the most were caught by a person reading a page, not by code.</w:t>
-      </w:r>
-    </w:p>
-    <w:p>
-      <w:pPr>
-        <w:spacing w:after="60"/>
+        <w:t xml:space="preserve">This report covers the tools we used and what each was for, how documents reached the AI and how the work was split between people and tools, the prompts that mattered most, the cases where the AI was confidently wrong, and what we would do differently. We logged 542 of those wrong cases. A person reading a page caught the ones that taught us the most.</w:t>
+      </w:r>
+    </w:p>
+    <w:p>
+      <w:pPr>
+        <w:spacing w:after="120"/>
       </w:pPr>
     </w:p>
     <w:tbl>
@@ -146,9 +146,9 @@
             </w:tcBorders>
             <w:tcMar>
               <w:top w:type="dxa" w:w="120"/>
-              <w:left w:type="dxa" w:w="80"/>
+              <w:left w:type="dxa" w:w="0"/>
               <w:bottom w:type="dxa" w:w="120"/>
-              <w:right w:type="dxa" w:w="80"/>
+              <w:right w:type="dxa" w:w="120"/>
             </w:tcMar>
           </w:tcPr>
           <w:p>
@@ -191,9 +191,9 @@
             </w:tcBorders>
             <w:tcMar>
               <w:top w:type="dxa" w:w="120"/>
-              <w:left w:type="dxa" w:w="80"/>
+              <w:left w:type="dxa" w:w="0"/>
               <w:bottom w:type="dxa" w:w="120"/>
-              <w:right w:type="dxa" w:w="80"/>
+              <w:right w:type="dxa" w:w="120"/>
             </w:tcMar>
           </w:tcPr>
           <w:p>
@@ -236,9 +236,9 @@
             </w:tcBorders>
             <w:tcMar>
               <w:top w:type="dxa" w:w="120"/>
-              <w:left w:type="dxa" w:w="80"/>
+              <w:left w:type="dxa" w:w="0"/>
               <w:bottom w:type="dxa" w:w="120"/>
-              <w:right w:type="dxa" w:w="80"/>
+              <w:right w:type="dxa" w:w="120"/>
             </w:tcMar>
           </w:tcPr>
           <w:p>
@@ -281,9 +281,9 @@
             </w:tcBorders>
             <w:tcMar>
               <w:top w:type="dxa" w:w="120"/>
-              <w:left w:type="dxa" w:w="80"/>
+              <w:left w:type="dxa" w:w="0"/>
               <w:bottom w:type="dxa" w:w="120"/>
-              <w:right w:type="dxa" w:w="80"/>
+              <w:right w:type="dxa" w:w="120"/>
             </w:tcMar>
           </w:tcPr>
           <w:p>
@@ -319,19 +319,19 @@
     </w:tbl>
     <w:p>
       <w:pPr>
-        <w:spacing w:after="200"/>
+        <w:spacing w:after="80"/>
       </w:pPr>
     </w:p>
     <w:p>
       <w:pPr>
         <w:keepNext/>
-        <w:spacing w:before="160" w:after="60"/>
+        <w:spacing w:before="140" w:after="80"/>
         <w:jc w:val="center"/>
       </w:pPr>
       <w:r>
         <w:drawing>
           <wp:inline distT="0" distB="0" distL="0" distR="0">
-            <wp:extent cx="6124575" cy="1685925"/>
+            <wp:extent cx="5962650" cy="742950"/>
             <wp:effectExtent t="0" r="0" b="0" l="0"/>
             <wp:docPr id="1" name="" descr="" title=""/>
             <wp:cNvGraphicFramePr>
@@ -356,7 +356,7 @@
                   <pic:spPr bwMode="auto">
                     <a:xfrm>
                       <a:off x="0" y="0"/>
-                      <a:ext cx="6124575" cy="1685925"/>
+                      <a:ext cx="5962650" cy="742950"/>
                     </a:xfrm>
                     <a:prstGeom prst="rect">
                       <a:avLst/>
@@ -371,7 +371,7 @@
     </w:p>
     <w:p>
       <w:pPr>
-        <w:spacing w:after="240"/>
+        <w:spacing w:after="220"/>
         <w:jc w:val="left"/>
       </w:pPr>
       <w:r>
@@ -381,7 +381,7 @@
           <w:sz w:val="17"/>
           <w:szCs w:val="17"/>
         </w:rPr>
-        <w:t xml:space="preserve">Figure 1. The weekend, Central Time. The case was released Saturday morning; the blind Part 1 pass ran Saturday night and Part 2 after midnight.</w:t>
+        <w:t xml:space="preserve">Figure 1. The weekend, Central Time. The case was released Saturday morning. The blind Part 1 pass ran Saturday night, and Part 2 after midnight.</w:t>
       </w:r>
     </w:p>
     <w:p>
@@ -424,7 +424,7 @@
           <w:sz w:val="21"/>
           <w:szCs w:val="21"/>
         </w:rPr>
-        <w:t xml:space="preserve">The case also names the two ways AI fails at this. On Part 1, a model will surface things management already said plainly: the patent cliff, the press-release headline, the starter thread. On Part 2, as the case puts it, AI will argue convincingly for almost any strategy. We treated both as design constraints rather than warnings.</w:t>
+        <w:t xml:space="preserve">The case also names the two ways AI fails at this. On Part 1, a model will surface things management has already said plainly, such as the patent cliff, the press-release headline and the starter thread. On Part 2, as the case puts it, AI will argue convincingly for almost any strategy. We treated both as design constraints.</w:t>
       </w:r>
     </w:p>
     <w:p>
@@ -453,7 +453,7 @@
           <w:left w:val="single" w:color="D97757" w:sz="18" w:space="12"/>
         </w:pBdr>
         <w:spacing w:after="200"/>
-        <w:ind w:left="360"/>
+        <w:ind w:left="360" w:right="720"/>
       </w:pPr>
       <w:r>
         <w:rPr>
@@ -476,19 +476,19 @@
           <w:sz w:val="21"/>
           <w:szCs w:val="21"/>
         </w:rPr>
-        <w:t xml:space="preserve">Three principles followed. Code fetches and verifies: every source is collected by scripts into a page-marked index, never pasted into a chat, and every quote is checked by exact match on its page. Agents reason, blind and adversarially: the readers who look for findings cannot see any prior run, and every candidate must survive two skeptics who read each other's arguments. Humans decide: a person opened the cited page behind every needle before it reached a slide, and the company pick rests on that read.</w:t>
+        <w:t xml:space="preserve">We worked to three rules. First, code fetches and verifies. Scripts collect every source into a page-marked index, nothing is pasted into a chat, and every quote is checked by exact match on its page. Second, agents reason blind and against each other. The readers who look for findings cannot see any prior run, and every candidate must survive two skeptics who read each other's arguments. Third, people decide. A person opened the cited page behind every needle before it reached a slide, and the company pick rests on that read.</w:t>
       </w:r>
     </w:p>
     <w:p>
       <w:pPr>
         <w:keepNext/>
-        <w:spacing w:before="160" w:after="60"/>
+        <w:spacing w:before="140" w:after="80"/>
         <w:jc w:val="center"/>
       </w:pPr>
       <w:r>
         <w:drawing>
           <wp:inline distT="0" distB="0" distL="0" distR="0">
-            <wp:extent cx="6124575" cy="2638425"/>
+            <wp:extent cx="6124575" cy="1857375"/>
             <wp:effectExtent t="0" r="0" b="0" l="0"/>
             <wp:docPr id="1" name="" descr="" title=""/>
             <wp:cNvGraphicFramePr>
@@ -513,7 +513,7 @@
                   <pic:spPr bwMode="auto">
                     <a:xfrm>
                       <a:off x="0" y="0"/>
-                      <a:ext cx="6124575" cy="2638425"/>
+                      <a:ext cx="6124575" cy="1857375"/>
                     </a:xfrm>
                     <a:prstGeom prst="rect">
                       <a:avLst/>
@@ -528,7 +528,7 @@
     </w:p>
     <w:p>
       <w:pPr>
-        <w:spacing w:after="240"/>
+        <w:spacing w:after="220"/>
         <w:jc w:val="left"/>
       </w:pPr>
       <w:r>
@@ -538,7 +538,7 @@
           <w:sz w:val="17"/>
           <w:szCs w:val="17"/>
         </w:rPr>
-        <w:t xml:space="preserve">Figure 2. The system at a glance. Sources flow left to right; people and a watcher session sit alongside the two stages where judgment happens.</w:t>
+        <w:t xml:space="preserve">Figure 2. The system at a glance. Sources flow left to right. People and a watcher session sit alongside the two stages where judgment happens.</w:t>
       </w:r>
     </w:p>
     <w:p>
@@ -567,7 +567,7 @@
           <w:sz w:val="21"/>
           <w:szCs w:val="21"/>
         </w:rPr>
-        <w:t xml:space="preserve">We used one model family for every reasoning step and ordinary engineering for everything else. No model wrote a number into the deliverable; models proposed, argued and verified, and code decided what could be shown.</w:t>
+        <w:t xml:space="preserve">We used one model family for every reasoning step and ordinary engineering for everything else. No model wrote a number into the deliverable. Models proposed findings, argued over them and verified them. Code decided what could be shown.</w:t>
       </w:r>
     </w:p>
     <w:tbl>
@@ -802,7 +802,7 @@
                 <w:sz w:val="17"/>
                 <w:szCs w:val="17"/>
               </w:rPr>
-              <w:t xml:space="preserve">Each session owned one branch and one open pull request; no two agents edited the same file. Chain: scaffold #1, gap-data #2, corpus #5, Parker's needle branch, data-moat #16, quant-model #21, ui #22.</w:t>
+              <w:t xml:space="preserve">Each session owned one branch and one open pull request. No two agents edited the same file. Chain: scaffold #1, gap-data #2, corpus #5, Parker's needle branch, data-moat #16, quant-model #21, ui #22.</w:t>
             </w:r>
           </w:p>
         </w:tc>
@@ -1240,7 +1240,7 @@
                 <w:sz w:val="17"/>
                 <w:szCs w:val="17"/>
               </w:rPr>
-              <w:t xml:space="preserve">Official transcripts to upgrade quote grades; analyst consensus for the 'was it priced in' test. Both licensed, so used locally and cited by label only.</w:t>
+              <w:t xml:space="preserve">Official transcripts to upgrade quote grades, and analyst consensus for the 'was it priced in' test. Both are licensed, so we used them locally and cited them by label only.</w:t>
             </w:r>
           </w:p>
         </w:tc>
@@ -1313,7 +1313,7 @@
                 <w:sz w:val="17"/>
                 <w:szCs w:val="17"/>
               </w:rPr>
-              <w:t xml:space="preserve">259 tests across the data, citation and model code; every behavior change carried a test.</w:t>
+              <w:t xml:space="preserve">259 tests across the data, citation and model code. Every behavior change carried a test.</w:t>
             </w:r>
           </w:p>
         </w:tc>
@@ -1580,7 +1580,7 @@
           <w:sz w:val="21"/>
           <w:szCs w:val="21"/>
         </w:rPr>
-        <w:t xml:space="preserve">No document was ever pasted into a prompt. Collectors fetched each filing, transcript, label and dataset by code and wrote page-marked text, with a marker of the form [[page N | printed P]] on every page so that a file page and a printed page could both be cited. The index stores pages, speaker turns and fact rows with full-text search, and every row carries a locator of the form doc_id#p&lt;page&gt; that opens the source.</w:t>
+        <w:t xml:space="preserve">We did not paste any document into a prompt. Collectors fetched each filing, transcript, label and dataset by code and wrote page-marked text, with a marker of the form [[page N | printed P]] on every page so that a file page and a printed page could both be cited. The index stores pages, speaker turns and fact rows with full-text search, and every row carries a locator of the form doc_id#p&lt;page&gt; that opens the source.</w:t>
       </w:r>
     </w:p>
     <w:p>
@@ -1594,19 +1594,19 @@
           <w:sz w:val="21"/>
           <w:szCs w:val="21"/>
         </w:rPr>
-        <w:t xml:space="preserve">Two rules made the index trustworthy enough to reason over. First, verify_quote: a sentence passes only if it is an exact substring of the one page it cites after normalising quotes, dashes, whitespace and case. The retrieval helpers drop any row that fails before an agent sees it. Second, grades and flags: transcripts are graded A to D and only A and B may be quoted; Bloomberg pages are cited by label and never copied; a mislabeled transcript and a set of fool.com files that open with model-written summaries are marked superseded or unquotable.</w:t>
+        <w:t xml:space="preserve">Two rules made the index trustworthy enough to reason over. The first is verify_quote. A sentence passes only if it is an exact substring of the one page it cites, after quotes, dashes, whitespace and case are normalised. The retrieval helpers drop any row that fails before an agent sees it. The second is grading and flagging. Transcripts are graded A to D and only A and B may be quoted. Bloomberg pages are cited by label and never copied. A mislabeled transcript and a set of fool.com files that open with model-written summaries are marked superseded or unquotable.</w:t>
       </w:r>
     </w:p>
     <w:p>
       <w:pPr>
         <w:keepNext/>
-        <w:spacing w:before="160" w:after="60"/>
+        <w:spacing w:before="140" w:after="80"/>
         <w:jc w:val="center"/>
       </w:pPr>
       <w:r>
         <w:drawing>
           <wp:inline distT="0" distB="0" distL="0" distR="0">
-            <wp:extent cx="6124575" cy="2038350"/>
+            <wp:extent cx="6124575" cy="1323975"/>
             <wp:effectExtent t="0" r="0" b="0" l="0"/>
             <wp:docPr id="1" name="" descr="" title=""/>
             <wp:cNvGraphicFramePr>
@@ -1631,7 +1631,7 @@
                   <pic:spPr bwMode="auto">
                     <a:xfrm>
                       <a:off x="0" y="0"/>
-                      <a:ext cx="6124575" cy="2038350"/>
+                      <a:ext cx="6124575" cy="1323975"/>
                     </a:xfrm>
                     <a:prstGeom prst="rect">
                       <a:avLst/>
@@ -1646,7 +1646,7 @@
     </w:p>
     <w:p>
       <w:pPr>
-        <w:spacing w:after="240"/>
+        <w:spacing w:after="220"/>
         <w:jc w:val="left"/>
       </w:pPr>
       <w:r>
@@ -1670,7 +1670,7 @@
           <w:sz w:val="21"/>
           <w:szCs w:val="21"/>
         </w:rPr>
-        <w:t xml:space="preserve">The scraper session ran five waves on Saturday: the ten shortlist companies at filing depth with ten quarters of graded calls; the Part 2 backend for all ten companies and 52 drugs (epidemiology, peers, deals, pipeline, costs, prescribers); every gap a free source could still fill; the eight case helpers; and a Part 2 evidence wave of labels, head-to-head trials, payer tables, deal comps and 325 page-anchored filing numbers for the three picked companies. Explicit negatives are rows too, so 'no public source' is itself citable.</w:t>
+        <w:t xml:space="preserve">The scraper session ran five waves on Saturday. The first fetched the ten shortlist companies at filing depth, with ten quarters of graded calls. The second built the Part 2 backend for all ten companies and 52 drugs, covering epidemiology, peers, deals, pipeline, costs and prescribers. The third filled every gap a free source could still fill. The fourth built the eight case helpers. The fifth was a Part 2 evidence wave of labels, head-to-head trials, payer tables, deal comps and 325 page-anchored filing numbers for the three picked companies. Explicit negatives are rows too, so 'no public source' is itself citable.</w:t>
       </w:r>
     </w:p>
     <w:p>
@@ -1700,19 +1700,33 @@
           <w:sz w:val="21"/>
           <w:szCs w:val="21"/>
         </w:rPr>
-        <w:t xml:space="preserve">Two people ran four long-lived Claude Code sessions, each in its own git worktree with its own branch and pull request. Parker owned the company read, the human judgment on findings, the Part 2 content and the deck. Aidan owned the API key, the repository and PR chain, the UI, the demo, this report and the submission. A fourth session, the watcher, did no building: it checked the other three against their goals, the rubric and the one deadline, and ruled on discrepancies when a refresh moved a published number.</w:t>
+        <w:t xml:space="preserve">Two people ran four long-lived Claude Code sessions, each in its own git worktree with its own branch and pull request. Parker owned the company read, the human judgment on findings, the Part 2 content and the deck. Aidan owned the API key, the repository and PR chain, the UI, the demo, this report and the submission. A fourth session, the watcher, did no building. It checked the other three against their goals, the rubric and the one deadline, and ruled on discrepancies when a refresh moved a published number.</w:t>
+      </w:r>
+    </w:p>
+    <w:p>
+      <w:pPr>
+        <w:spacing w:after="160" w:line="300"/>
+      </w:pPr>
+      <w:r>
+        <w:rPr>
+          <w:rFonts w:ascii="Arial" w:cs="Arial" w:eastAsia="Arial" w:hAnsi="Arial"/>
+          <w:color w:val="141413"/>
+          <w:sz w:val="21"/>
+          <w:szCs w:val="21"/>
+        </w:rPr>
+        <w:t xml:space="preserve">Parker's branch also carried a nugget miner and a red-team agent that read footnotes, risk language and call Q&amp;A for each company and scored our work against the rubric. We demoted an earlier quantitative league table, which ranked companies by a scoring equation, to internal triage on Saturday evening after a scorer bug misled it (Section 5). Nothing from it appears in the pitch.</w:t>
       </w:r>
     </w:p>
     <w:p>
       <w:pPr>
         <w:keepNext/>
-        <w:spacing w:before="160" w:after="60"/>
+        <w:spacing w:before="140" w:after="80"/>
         <w:jc w:val="center"/>
       </w:pPr>
       <w:r>
         <w:drawing>
           <wp:inline distT="0" distB="0" distL="0" distR="0">
-            <wp:extent cx="6124575" cy="2981325"/>
+            <wp:extent cx="4848225" cy="1828800"/>
             <wp:effectExtent t="0" r="0" b="0" l="0"/>
             <wp:docPr id="1" name="" descr="" title=""/>
             <wp:cNvGraphicFramePr>
@@ -1737,7 +1751,7 @@
                   <pic:spPr bwMode="auto">
                     <a:xfrm>
                       <a:off x="0" y="0"/>
-                      <a:ext cx="6124575" cy="2981325"/>
+                      <a:ext cx="4848225" cy="1828800"/>
                     </a:xfrm>
                     <a:prstGeom prst="rect">
                       <a:avLst/>
@@ -1752,7 +1766,7 @@
     </w:p>
     <w:p>
       <w:pPr>
-        <w:spacing w:after="240"/>
+        <w:spacing w:after="220"/>
         <w:jc w:val="left"/>
       </w:pPr>
       <w:r>
@@ -1776,21 +1790,7 @@
           <w:sz w:val="21"/>
           <w:szCs w:val="21"/>
         </w:rPr>
-        <w:t xml:space="preserve">Parker's branch also carried a nugget miner and a red-team agent that read footnotes, risk language and call Q&amp;A for each company and scored our work against the rubric. An earlier quantitative league table that ranked companies by a scoring equation was demoted on Saturday evening to internal triage after it was led by a scorer bug (Section 5); nothing from it appears in the pitch.</w:t>
-      </w:r>
-    </w:p>
-    <w:p>
-      <w:pPr>
-        <w:spacing w:after="160" w:line="300"/>
-      </w:pPr>
-      <w:r>
-        <w:rPr>
-          <w:rFonts w:ascii="Arial" w:cs="Arial" w:eastAsia="Arial" w:hAnsi="Arial"/>
-          <w:color w:val="141413"/>
-          <w:sz w:val="21"/>
-          <w:szCs w:val="21"/>
-        </w:rPr>
-        <w:t xml:space="preserve">Scope control mattered more than clever prompting. Every worker agent opened with the same frame: you are a worker, not an orchestrator; work only in your own worktree; own only the files named; do not spawn agents; report file paths and counts. Two agents never edited the same file all weekend.</w:t>
+        <w:t xml:space="preserve">Keeping each agent's scope narrow did more for us than any wording in the prompts. Every worker agent opened with the same frame. It is a worker and not an orchestrator, it works only in its own worktree, it owns only the files named, it does not spawn agents, and it reports file paths and counts. No two agents edited the same file all weekend.</w:t>
       </w:r>
     </w:p>
     <w:p>
@@ -1820,33 +1820,19 @@
           <w:sz w:val="21"/>
           <w:szCs w:val="21"/>
         </w:rPr>
-        <w:t xml:space="preserve">The Part 1 pipeline is blind, adversarial and sealed. Ten reader agents, one per company, were launched together Saturday at 10:27 pm with the case PDF, the rubric and the citation index, and a written list of files they were forbidden to open: any prior run, the league table, the nugget files, the red-team notes, every other worktree. Each walked the case's eight hiding places and wrote candidates with page-verified evidence as it found them.</w:t>
-      </w:r>
-    </w:p>
-    <w:p>
-      <w:pPr>
-        <w:spacing w:after="160" w:line="300"/>
-      </w:pPr>
-      <w:r>
-        <w:rPr>
-          <w:rFonts w:ascii="Arial" w:cs="Arial" w:eastAsia="Arial" w:hAnsi="Arial"/>
-          <w:color w:val="141413"/>
-          <w:sz w:val="21"/>
-          <w:szCs w:val="21"/>
-        </w:rPr>
-        <w:t xml:space="preserve">Each company's candidates then went to two skeptics with different lenses, materiality and math versus obviousness, both instructed to assume every candidate is wrong until the cited page proves otherwise and to open each page themselves. In round two the same agents were resumed, read the other lens's file against the sources, and conceded, held or narrowed. A synthesizer per company ruled each candidate survived, narrowed or killed without voting or averaging. A single ranker picked three companies on the case's test, wrote selection.md, appended its sha256, and only then was allowed to read the league table and the red team to write a separate appendix.</w:t>
+        <w:t xml:space="preserve">The model session launched ten reader agents, one per company, together on Saturday at 10:27 pm. Each had the case PDF, the rubric, the citation index and a written list of files it was forbidden to open, which covered any prior run, the league table, the nugget files, the red-team notes and every other worktree. Each walked the case's eight hiding places and wrote candidates with page-verified evidence as it found them.</w:t>
       </w:r>
     </w:p>
     <w:p>
       <w:pPr>
         <w:keepNext/>
-        <w:spacing w:before="160" w:after="60"/>
+        <w:spacing w:before="140" w:after="80"/>
         <w:jc w:val="center"/>
       </w:pPr>
       <w:r>
         <w:drawing>
           <wp:inline distT="0" distB="0" distL="0" distR="0">
-            <wp:extent cx="6124575" cy="3314700"/>
+            <wp:extent cx="6124575" cy="2800350"/>
             <wp:effectExtent t="0" r="0" b="0" l="0"/>
             <wp:docPr id="1" name="" descr="" title=""/>
             <wp:cNvGraphicFramePr>
@@ -1871,7 +1857,7 @@
                   <pic:spPr bwMode="auto">
                     <a:xfrm>
                       <a:off x="0" y="0"/>
-                      <a:ext cx="6124575" cy="3314700"/>
+                      <a:ext cx="6124575" cy="2800350"/>
                     </a:xfrm>
                     <a:prstGeom prst="rect">
                       <a:avLst/>
@@ -1886,7 +1872,7 @@
     </w:p>
     <w:p>
       <w:pPr>
-        <w:spacing w:after="240"/>
+        <w:spacing w:after="220"/>
         <w:jc w:val="left"/>
       </w:pPr>
       <w:r>
@@ -1896,7 +1882,7 @@
           <w:sz w:val="17"/>
           <w:szCs w:val="17"/>
         </w:rPr>
-        <w:t xml:space="preserve">Figure 5. Part 1 in two phases. Phase A ran in 45 minutes of wall clock; Phase B wrote the deliverables through the gate and an independent verifier.</w:t>
+        <w:t xml:space="preserve">Figure 5. Part 1 in two phases. Phase A ran in 45 minutes of wall clock. Phase B wrote the deliverables through the gate and an independent verifier.</w:t>
       </w:r>
     </w:p>
     <w:p>
@@ -1910,7 +1896,7 @@
           <w:sz w:val="21"/>
           <w:szCs w:val="21"/>
         </w:rPr>
-        <w:t xml:space="preserve">The skeptics killed about 80 percent of what the readers found, nearly always for the same reason: management already said it. The honest result of the trace is '0 survived as first stated, 25 narrowed', and the chat shows that. The sealed pick was Amgen, Merck and Pfizer. The blind result agreed with Parker's red-team read on Merck and Pfizer and with the retired league table on Amgen; Johnson &amp; Johnson, which the league had favoured, dropped out.</w:t>
+        <w:t xml:space="preserve">Each company's candidates then went to two skeptics with different lenses, materiality and math versus obviousness, both instructed to assume every candidate is wrong until the cited page proves otherwise and to open each page themselves. In round two the same agents were resumed, read the other lens's file against the sources, and conceded, held or narrowed. A synthesizer per company ruled each candidate survived, narrowed or killed without voting or averaging. A single ranker picked three companies on the case's test, wrote selection.md, appended its sha256, and only then was allowed to read the league table and the red team to write a separate appendix.</w:t>
       </w:r>
     </w:p>
     <w:p>
@@ -1924,7 +1910,21 @@
           <w:sz w:val="21"/>
           <w:szCs w:val="21"/>
         </w:rPr>
-        <w:t xml:space="preserve">Phase B then wrote each company's deliverable from the sealed rulings: five findings (killed-as-obvious rows used to fill the table are tagged on the record), the Sharpest Needle by one plain rule, the biggest impact that analysts asked about least, and the five-row product comparison with a financial tie, a growth limiter and an evidence-graded priced-in call. Every cell ran through the gate. A fresh verifier agent then re-opened all 261 citations and re-checked all 503 numbers with the instruction to assume each was wrong; it found seven defects, all of them attribution or scope rather than arithmetic, and all were fixed and re-gated.</w:t>
+        <w:t xml:space="preserve">The skeptics killed about 80 percent of what the readers found, nearly always because management had already said it. The honest result of the trace is '0 survived as first stated, 25 narrowed', and the chat shows that. The sealed pick was Amgen, Merck and Pfizer. The blind result agreed with Parker's red-team read on Merck and Pfizer and with the retired league table on Amgen; Johnson &amp; Johnson, which the league had favoured, dropped out.</w:t>
+      </w:r>
+    </w:p>
+    <w:p>
+      <w:pPr>
+        <w:spacing w:after="160" w:line="300"/>
+      </w:pPr>
+      <w:r>
+        <w:rPr>
+          <w:rFonts w:ascii="Arial" w:cs="Arial" w:eastAsia="Arial" w:hAnsi="Arial"/>
+          <w:color w:val="141413"/>
+          <w:sz w:val="21"/>
+          <w:szCs w:val="21"/>
+        </w:rPr>
+        <w:t xml:space="preserve">Phase B then wrote each company's deliverable from the sealed rulings: five findings (killed-as-obvious rows used to fill the table are tagged on the record), the Sharpest Needle by one plain rule, the biggest impact that analysts asked about least, and the five-row product comparison with a financial tie, a growth limiter and an evidence-graded priced-in call. Every cell ran through the gate. A fresh verifier agent then re-opened all 261 citations and re-checked all 503 numbers with the instruction to assume each was wrong; it found seven defects, every one an error of attribution or scope and none of arithmetic. We fixed and re-gated all seven.</w:t>
       </w:r>
     </w:p>
     <w:tbl>
@@ -2158,7 +2158,7 @@
                 <w:sz w:val="17"/>
                 <w:szCs w:val="17"/>
               </w:rPr>
-              <w:t xml:space="preserve">A $2.4B TAVNEOS intangible carried at about 5.2 times FY2025 sales against a drug the FDA has formally proposed to withdraw; not raised on any call.</w:t>
+              <w:t xml:space="preserve">A $2.4B TAVNEOS intangible carried at about 5.2 times FY2025 sales against a drug the FDA has formally proposed to withdraw. Not raised on any call.</w:t>
             </w:r>
           </w:p>
         </w:tc>
@@ -2440,7 +2440,7 @@
                 <w:sz w:val="17"/>
                 <w:szCs w:val="17"/>
               </w:rPr>
-              <w:t xml:space="preserve">U.S. Vyndaqel revenue flat while the U.S. ATTR-CM class grew 47 percent in H1 2026; credited as a quantification, since rivals and management have described the share loss.</w:t>
+              <w:t xml:space="preserve">U.S. Vyndaqel revenue flat while the U.S. ATTR-CM class grew 47 percent in H1 2026. Credited as a quantification, since rivals and management have described the share loss.</w:t>
             </w:r>
           </w:p>
         </w:tc>
@@ -2546,19 +2546,19 @@
           <w:sz w:val="21"/>
           <w:szCs w:val="21"/>
         </w:rPr>
-        <w:t xml:space="preserve">Part 2 ran only for the three sealed companies and reused the structure. A strategist agent per company, with fresh context and the same forbidden list, proposed at least four costed moves of at least two types from the sealed Part 1 findings, and recorded every data gap as a request rather than a guess. Two skeptics, a CFO-and-math lens and a Decider-and-compliance lens, defaulted to kill, each received the specific operands, comparables and deciders to test, and were resumed for a second round against each other's files. A synthesizer picked one move ruled survived or narrowed, never one the CFO skeptic had refuted on the math, with exactly two rejected alternatives, kill signals with thresholds and month windows, decider evidence that states what it cannot tell, and the six promotional rules with a claims map wherever a doctor or patient would see material.</w:t>
+        <w:t xml:space="preserve">Part 2 ran only for the three sealed companies and reused the structure. A strategist agent per company, with fresh context and the same forbidden list, proposed at least four costed moves of at least two types from the sealed Part 1 findings, and recorded every data gap as a request rather than a guess. Two skeptics, a CFO-and-math lens and a Decider-and-compliance lens, defaulted to kill, each received the specific operands, comparables and deciders to test, and were resumed for a second round against each other's files. A synthesizer picked one move that had been ruled survived or narrowed, and never one the CFO skeptic had refuted on the math. The pick carried exactly two rejected alternatives, kill signals with thresholds and month windows, decider evidence that states what it cannot tell, and the six promotional rules with a claims map wherever a doctor or patient would see material.</w:t>
       </w:r>
     </w:p>
     <w:p>
       <w:pPr>
         <w:keepNext/>
-        <w:spacing w:before="160" w:after="60"/>
+        <w:spacing w:before="140" w:after="80"/>
         <w:jc w:val="center"/>
       </w:pPr>
       <w:r>
         <w:drawing>
           <wp:inline distT="0" distB="0" distL="0" distR="0">
-            <wp:extent cx="6124575" cy="2552700"/>
+            <wp:extent cx="6124575" cy="1905000"/>
             <wp:effectExtent t="0" r="0" b="0" l="0"/>
             <wp:docPr id="1" name="" descr="" title=""/>
             <wp:cNvGraphicFramePr>
@@ -2583,7 +2583,7 @@
                   <pic:spPr bwMode="auto">
                     <a:xfrm>
                       <a:off x="0" y="0"/>
-                      <a:ext cx="6124575" cy="2552700"/>
+                      <a:ext cx="6124575" cy="1905000"/>
                     </a:xfrm>
                     <a:prstGeom prst="rect">
                       <a:avLst/>
@@ -2598,7 +2598,7 @@
     </w:p>
     <w:p>
       <w:pPr>
-        <w:spacing w:after="240"/>
+        <w:spacing w:after="220"/>
         <w:jc w:val="left"/>
       </w:pPr>
       <w:r>
@@ -2608,7 +2608,7 @@
           <w:sz w:val="17"/>
           <w:szCs w:val="17"/>
         </w:rPr>
-        <w:t xml:space="preserve">Figure 6. Part 2. The scraper's evidence wave landed mid-run; files announced but not yet on disk stayed labelled as assumptions.</w:t>
+        <w:t xml:space="preserve">Figure 6. Part 2. The scraper's evidence wave landed mid-run. Files announced but not yet on disk stayed labelled as assumptions.</w:t>
       </w:r>
     </w:p>
     <w:tbl>
@@ -3214,7 +3214,7 @@
           <w:sz w:val="21"/>
           <w:szCs w:val="21"/>
         </w:rPr>
-        <w:t xml:space="preserve">Of 13 candidate moves, nine were killed and four narrowed. Every chosen move is a narrowed candidate labelled unrefuted rather than confirmed, and the points the two skeptics could not settle are printed as two positions, never averaged.</w:t>
+        <w:t xml:space="preserve">Of 13 candidate moves, nine were killed and four narrowed. Every chosen move is a narrowed candidate, and its label is unrefuted, not confirmed. Where the two skeptics could not settle a point, the deliverable prints both positions and does not average them.</w:t>
       </w:r>
     </w:p>
     <w:p>
@@ -3250,13 +3250,13 @@
     <w:p>
       <w:pPr>
         <w:keepNext/>
-        <w:spacing w:before="160" w:after="60"/>
+        <w:spacing w:before="140" w:after="80"/>
         <w:jc w:val="center"/>
       </w:pPr>
       <w:r>
         <w:drawing>
           <wp:inline distT="0" distB="0" distL="0" distR="0">
-            <wp:extent cx="6124575" cy="2714625"/>
+            <wp:extent cx="6124575" cy="1895475"/>
             <wp:effectExtent t="0" r="0" b="0" l="0"/>
             <wp:docPr id="1" name="" descr="" title=""/>
             <wp:cNvGraphicFramePr>
@@ -3281,7 +3281,7 @@
                   <pic:spPr bwMode="auto">
                     <a:xfrm>
                       <a:off x="0" y="0"/>
-                      <a:ext cx="6124575" cy="2714625"/>
+                      <a:ext cx="6124575" cy="1895475"/>
                     </a:xfrm>
                     <a:prstGeom prst="rect">
                       <a:avLst/>
@@ -3296,7 +3296,7 @@
     </w:p>
     <w:p>
       <w:pPr>
-        <w:spacing w:after="240"/>
+        <w:spacing w:after="220"/>
         <w:jc w:val="left"/>
       </w:pPr>
       <w:r>
@@ -3306,7 +3306,7 @@
           <w:sz w:val="17"/>
           <w:szCs w:val="17"/>
         </w:rPr>
-        <w:t xml:space="preserve">Figure 7. The gate decides what a number may be. It fails closed: a sentence with an unsupported figure is withheld and logged, never shown with a guess.</w:t>
+        <w:t xml:space="preserve">Figure 7. The gate decides what a number may be. It fails closed. A sentence with an unsupported figure is withheld and logged, and is never shown with a guess.</w:t>
       </w:r>
     </w:p>
     <w:p>
@@ -3336,7 +3336,7 @@
           <w:sz w:val="21"/>
           <w:szCs w:val="21"/>
         </w:rPr>
-        <w:t xml:space="preserve">Every figure in every finding, product cell, move, budget, math step, kill signal and promotional claim is tokenised and checked against the quoted span of its citation, a formula whose operands are each cited and which recomputes the printed value, or a printed assumption label. A text with no numbers reports 'no numbers', not a pass. The rule is strict on purpose: a numeral elsewhere on the same page does not count, because our first gate accepted exactly that and approved wrong numbers (Section 5).</w:t>
+        <w:t xml:space="preserve">Every figure in every finding, product cell, move, budget, math step, kill signal and promotional claim is tokenised and checked against the quoted span of its citation, a formula whose operands are each cited and which recomputes the printed value, or a printed assumption label. A text with no numbers reports 'no numbers', not a pass. The rule is strict on purpose. A numeral elsewhere on the same page does not count, because our first gate accepted exactly that and approved wrong numbers (Section 5).</w:t>
       </w:r>
     </w:p>
     <w:p>
@@ -3366,7 +3366,7 @@
           <w:sz w:val="21"/>
           <w:szCs w:val="21"/>
         </w:rPr>
-        <w:t xml:space="preserve">A fresh agent that never saw the writers' reasoning re-opened every citation and re-ran every derivation. The gate checks numbers; the verifier checks attribution and scope, which is where all seven Part 1 defects were.</w:t>
+        <w:t xml:space="preserve">A fresh agent that never saw the writers' reasoning re-opened every citation and re-ran every derivation. The gate checks numbers. The verifier checks attribution and scope, which is where all seven Part 1 defects were.</w:t>
       </w:r>
     </w:p>
     <w:p>
@@ -3396,7 +3396,7 @@
           <w:sz w:val="21"/>
           <w:szCs w:val="21"/>
         </w:rPr>
-        <w:t xml:space="preserve">Before an answer is cached for the chat, the exporter re-runs the structural contract: every block passed or had no numbers, exactly two rejected alternatives, drivers that name real Part 1 findings, no figure in prose that no passed block governs. A company that fails is not written; its tab shows as 'writing'. Both Part 1 and Part 2 exported with zero errors and zero figures withheld.</w:t>
+        <w:t xml:space="preserve">Before an answer is cached for the chat, the exporter re-runs the structural contract. It requires that every block passed or had no numbers, that there are exactly two rejected alternatives, that drivers name real Part 1 findings, and that no figure appears in prose unless a passed block governs it. A company that fails is not written, and its tab shows as 'writing'. Both Part 1 and Part 2 exported with zero errors and zero figures withheld.</w:t>
       </w:r>
     </w:p>
     <w:p>
@@ -3456,7 +3456,7 @@
           <w:sz w:val="21"/>
           <w:szCs w:val="21"/>
         </w:rPr>
-        <w:t xml:space="preserve">A person opened the cited page behind every needle. Several of our worst errors passed every code check and were caught only there.</w:t>
+        <w:t xml:space="preserve">A person opened the cited page behind every needle. Several of our worst errors passed every code check, and that read is where we caught them.</w:t>
       </w:r>
     </w:p>
     <w:p>
@@ -3470,7 +3470,7 @@
           <w:sz w:val="21"/>
           <w:szCs w:val="21"/>
         </w:rPr>
-        <w:t xml:space="preserve">Across sessions, the watcher ran status checks, enforced the single deadline, and ruled on refresh discrepancies: a cited benchmark replaces an unsourced assumption even when it moves a number; a timing assumption stays when no page dates it; a published number that fails against a new source is logged and reported before anyone edits it.</w:t>
+        <w:t xml:space="preserve">Across sessions, the watcher ran status checks, enforced the single deadline and ruled on refresh discrepancies. Its rulings were that a cited benchmark replaces an unsourced assumption even when it moves a number, that a timing assumption stays when no page dates it, and that a published number which fails against a new source is logged and reported before anyone edits it.</w:t>
       </w:r>
     </w:p>
     <w:p>
@@ -3499,13 +3499,13 @@
           <w:sz w:val="21"/>
           <w:szCs w:val="21"/>
         </w:rPr>
-        <w:t xml:space="preserve">Most of the prompting lives in written briefs, one per role, that every worker was told to read in full before starting: the forbidden lists, the output contracts, the gate rules, the eight category strings verbatim from the case. The launch prompts below pointed each agent at its brief and added the company-specific facts to test. They are reproduced exactly as sent, with one example per role; the other companies' prompts differ only in ticker and the specific checks lifted from that company's files.</w:t>
+        <w:t xml:space="preserve">Most of the prompting lives in written briefs, one per role, that every worker was told to read in full before starting: the forbidden lists, the output contracts, the gate rules, the eight category strings verbatim from the case. The launch prompts below pointed each agent at its brief and added the company-specific facts to test. They are reproduced exactly as sent, with one example per role. The other companies' prompts differ only in ticker and in the specific checks lifted from that company's files.</w:t>
       </w:r>
     </w:p>
     <w:p>
       <w:pPr>
         <w:keepNext/>
-        <w:spacing w:before="160" w:after="40"/>
+        <w:spacing w:before="200" w:after="60"/>
       </w:pPr>
       <w:r>
         <w:rPr>
@@ -3519,167 +3519,175 @@
         <w:t xml:space="preserve">The worker preamble, on every launch</w:t>
       </w:r>
     </w:p>
-    <w:p>
-      <w:pPr>
-        <w:keepNext/>
-        <w:keepLines/>
-        <w:shd w:fill="F0EEE6" w:color="auto" w:val="clear"/>
-        <w:spacing w:before="0" w:after="0" w:line="250"/>
-        <w:ind w:left="200" w:right="200"/>
-      </w:pPr>
-      <w:r>
-        <w:rPr>
-          <w:rFonts w:ascii="Courier New" w:cs="Courier New" w:eastAsia="Courier New" w:hAnsi="Courier New"/>
-          <w:color w:val="141413"/>
-          <w:sz w:val="15"/>
-          <w:szCs w:val="15"/>
-        </w:rPr>
-        <w:t xml:space="preserve">CONTEXT: You are a WORKER agent, not an orchestrator.</w:t>
-      </w:r>
-    </w:p>
-    <w:p>
-      <w:pPr>
-        <w:keepNext/>
-        <w:keepLines/>
-        <w:shd w:fill="F0EEE6" w:color="auto" w:val="clear"/>
-        <w:spacing w:before="0" w:after="0" w:line="250"/>
-        <w:ind w:left="200" w:right="200"/>
-      </w:pPr>
-      <w:r>
-        <w:rPr>
-          <w:rFonts w:ascii="Courier New" w:cs="Courier New" w:eastAsia="Courier New" w:hAnsi="Courier New"/>
-          <w:color w:val="141413"/>
-          <w:sz w:val="15"/>
-          <w:szCs w:val="15"/>
-        </w:rPr>
-        <w:t xml:space="preserve"> </w:t>
-      </w:r>
-    </w:p>
-    <w:p>
-      <w:pPr>
-        <w:keepNext/>
-        <w:keepLines/>
-        <w:shd w:fill="F0EEE6" w:color="auto" w:val="clear"/>
-        <w:spacing w:before="0" w:after="0" w:line="250"/>
-        <w:ind w:left="200" w:right="200"/>
-      </w:pPr>
-      <w:r>
-        <w:rPr>
-          <w:rFonts w:ascii="Courier New" w:cs="Courier New" w:eastAsia="Courier New" w:hAnsi="Courier New"/>
-          <w:color w:val="141413"/>
-          <w:sz w:val="15"/>
-          <w:szCs w:val="15"/>
-        </w:rPr>
-        <w:t xml:space="preserve">RULES:</w:t>
-      </w:r>
-    </w:p>
-    <w:p>
-      <w:pPr>
-        <w:keepNext/>
-        <w:keepLines/>
-        <w:shd w:fill="F0EEE6" w:color="auto" w:val="clear"/>
-        <w:spacing w:before="0" w:after="0" w:line="250"/>
-        <w:ind w:left="200" w:right="200"/>
-      </w:pPr>
-      <w:r>
-        <w:rPr>
-          <w:rFonts w:ascii="Courier New" w:cs="Courier New" w:eastAsia="Courier New" w:hAnsi="Courier New"/>
-          <w:color w:val="141413"/>
-          <w:sz w:val="15"/>
-          <w:szCs w:val="15"/>
-        </w:rPr>
-        <w:t xml:space="preserve">- Complete ONLY the task described below</w:t>
-      </w:r>
-    </w:p>
-    <w:p>
-      <w:pPr>
-        <w:keepNext/>
-        <w:keepLines/>
-        <w:shd w:fill="F0EEE6" w:color="auto" w:val="clear"/>
-        <w:spacing w:before="0" w:after="0" w:line="250"/>
-        <w:ind w:left="200" w:right="200"/>
-      </w:pPr>
-      <w:r>
-        <w:rPr>
-          <w:rFonts w:ascii="Courier New" w:cs="Courier New" w:eastAsia="Courier New" w:hAnsi="Courier New"/>
-          <w:color w:val="141413"/>
-          <w:sz w:val="15"/>
-          <w:szCs w:val="15"/>
-        </w:rPr>
-        <w:t xml:space="preserve">- Use tools directly (Read, Bash, Write, etc.)</w:t>
-      </w:r>
-    </w:p>
-    <w:p>
-      <w:pPr>
-        <w:keepNext/>
-        <w:keepLines/>
-        <w:shd w:fill="F0EEE6" w:color="auto" w:val="clear"/>
-        <w:spacing w:before="0" w:after="0" w:line="250"/>
-        <w:ind w:left="200" w:right="200"/>
-      </w:pPr>
-      <w:r>
-        <w:rPr>
-          <w:rFonts w:ascii="Courier New" w:cs="Courier New" w:eastAsia="Courier New" w:hAnsi="Courier New"/>
-          <w:color w:val="141413"/>
-          <w:sz w:val="15"/>
-          <w:szCs w:val="15"/>
-        </w:rPr>
-        <w:t xml:space="preserve">- Write results to disk incrementally as you find them</w:t>
-      </w:r>
-    </w:p>
-    <w:p>
-      <w:pPr>
-        <w:keepNext/>
-        <w:keepLines/>
-        <w:shd w:fill="F0EEE6" w:color="auto" w:val="clear"/>
-        <w:spacing w:before="0" w:after="0" w:line="250"/>
-        <w:ind w:left="200" w:right="200"/>
-      </w:pPr>
-      <w:r>
-        <w:rPr>
-          <w:rFonts w:ascii="Courier New" w:cs="Courier New" w:eastAsia="Courier New" w:hAnsi="Courier New"/>
-          <w:color w:val="141413"/>
-          <w:sz w:val="15"/>
-          <w:szCs w:val="15"/>
-        </w:rPr>
-        <w:t xml:space="preserve">- Do NOT spawn sub-agents</w:t>
-      </w:r>
-    </w:p>
-    <w:p>
-      <w:pPr>
-        <w:keepNext/>
-        <w:keepLines/>
-        <w:shd w:fill="F0EEE6" w:color="auto" w:val="clear"/>
-        <w:spacing w:before="0" w:after="0" w:line="250"/>
-        <w:ind w:left="200" w:right="200"/>
-      </w:pPr>
-      <w:r>
-        <w:rPr>
-          <w:rFonts w:ascii="Courier New" w:cs="Courier New" w:eastAsia="Courier New" w:hAnsi="Courier New"/>
-          <w:color w:val="141413"/>
-          <w:sz w:val="15"/>
-          <w:szCs w:val="15"/>
-        </w:rPr>
-        <w:t xml:space="preserve">- Do NOT call TaskCreate/TaskUpdate or progress.sh</w:t>
-      </w:r>
-    </w:p>
-    <w:p>
-      <w:pPr>
-        <w:keepNext w:val="false"/>
-        <w:keepLines/>
-        <w:shd w:fill="F0EEE6" w:color="auto" w:val="clear"/>
-        <w:spacing w:before="0" w:after="200" w:line="250"/>
-        <w:ind w:left="200" w:right="200"/>
-      </w:pPr>
-      <w:r>
-        <w:rPr>
-          <w:rFonts w:ascii="Courier New" w:cs="Courier New" w:eastAsia="Courier New" w:hAnsi="Courier New"/>
-          <w:color w:val="141413"/>
-          <w:sz w:val="15"/>
-          <w:szCs w:val="15"/>
-        </w:rPr>
-        <w:t xml:space="preserve">- Report results with absolute file paths and counts</w:t>
-      </w:r>
+    <w:tbl>
+      <w:tblPr>
+        <w:tblW w:type="dxa" w:w="9648"/>
+        <w:tblBorders>
+          <w:top w:val="single" w:color="auto" w:sz="4"/>
+          <w:left w:val="single" w:color="auto" w:sz="4"/>
+          <w:bottom w:val="single" w:color="auto" w:sz="4"/>
+          <w:right w:val="single" w:color="auto" w:sz="4"/>
+          <w:insideH w:val="single" w:color="auto" w:sz="4"/>
+          <w:insideV w:val="single" w:color="auto" w:sz="4"/>
+        </w:tblBorders>
+      </w:tblPr>
+      <w:tblGrid>
+        <w:gridCol w:w="9648"/>
+      </w:tblGrid>
+      <w:tr>
+        <w:trPr>
+          <w:cantSplit/>
+        </w:trPr>
+        <w:tc>
+          <w:tcPr>
+            <w:tcW w:type="dxa" w:w="9648"/>
+            <w:tcBorders>
+              <w:top w:val="none" w:color="FFFFFF" w:sz="0"/>
+              <w:left w:val="none" w:color="FFFFFF" w:sz="0"/>
+              <w:bottom w:val="none" w:color="FFFFFF" w:sz="0"/>
+              <w:right w:val="none" w:color="FFFFFF" w:sz="0"/>
+            </w:tcBorders>
+            <w:shd w:fill="F0EEE6" w:color="auto" w:val="clear"/>
+            <w:tcMar>
+              <w:top w:type="dxa" w:w="120"/>
+              <w:left w:type="dxa" w:w="160"/>
+              <w:bottom w:type="dxa" w:w="120"/>
+              <w:right w:type="dxa" w:w="160"/>
+            </w:tcMar>
+          </w:tcPr>
+          <w:p>
+            <w:pPr>
+              <w:spacing w:after="0" w:line="228"/>
+            </w:pPr>
+            <w:r>
+              <w:rPr>
+                <w:rFonts w:ascii="Courier New" w:cs="Courier New" w:eastAsia="Courier New" w:hAnsi="Courier New"/>
+                <w:color w:val="141413"/>
+                <w:sz w:val="14"/>
+                <w:szCs w:val="14"/>
+              </w:rPr>
+              <w:t xml:space="preserve">CONTEXT: You are a WORKER agent, not an orchestrator.</w:t>
+            </w:r>
+          </w:p>
+          <w:p>
+            <w:pPr>
+              <w:spacing w:after="0" w:line="228"/>
+            </w:pPr>
+            <w:r>
+              <w:rPr>
+                <w:rFonts w:ascii="Courier New" w:cs="Courier New" w:eastAsia="Courier New" w:hAnsi="Courier New"/>
+                <w:color w:val="141413"/>
+                <w:sz w:val="14"/>
+                <w:szCs w:val="14"/>
+              </w:rPr>
+              <w:t xml:space="preserve"> </w:t>
+            </w:r>
+          </w:p>
+          <w:p>
+            <w:pPr>
+              <w:spacing w:after="0" w:line="228"/>
+            </w:pPr>
+            <w:r>
+              <w:rPr>
+                <w:rFonts w:ascii="Courier New" w:cs="Courier New" w:eastAsia="Courier New" w:hAnsi="Courier New"/>
+                <w:color w:val="141413"/>
+                <w:sz w:val="14"/>
+                <w:szCs w:val="14"/>
+              </w:rPr>
+              <w:t xml:space="preserve">RULES:</w:t>
+            </w:r>
+          </w:p>
+          <w:p>
+            <w:pPr>
+              <w:spacing w:after="0" w:line="228"/>
+            </w:pPr>
+            <w:r>
+              <w:rPr>
+                <w:rFonts w:ascii="Courier New" w:cs="Courier New" w:eastAsia="Courier New" w:hAnsi="Courier New"/>
+                <w:color w:val="141413"/>
+                <w:sz w:val="14"/>
+                <w:szCs w:val="14"/>
+              </w:rPr>
+              <w:t xml:space="preserve">- Complete ONLY the task described below</w:t>
+            </w:r>
+          </w:p>
+          <w:p>
+            <w:pPr>
+              <w:spacing w:after="0" w:line="228"/>
+            </w:pPr>
+            <w:r>
+              <w:rPr>
+                <w:rFonts w:ascii="Courier New" w:cs="Courier New" w:eastAsia="Courier New" w:hAnsi="Courier New"/>
+                <w:color w:val="141413"/>
+                <w:sz w:val="14"/>
+                <w:szCs w:val="14"/>
+              </w:rPr>
+              <w:t xml:space="preserve">- Use tools directly (Read, Bash, Write, etc.)</w:t>
+            </w:r>
+          </w:p>
+          <w:p>
+            <w:pPr>
+              <w:spacing w:after="0" w:line="228"/>
+            </w:pPr>
+            <w:r>
+              <w:rPr>
+                <w:rFonts w:ascii="Courier New" w:cs="Courier New" w:eastAsia="Courier New" w:hAnsi="Courier New"/>
+                <w:color w:val="141413"/>
+                <w:sz w:val="14"/>
+                <w:szCs w:val="14"/>
+              </w:rPr>
+              <w:t xml:space="preserve">- Write results to disk incrementally as you find them</w:t>
+            </w:r>
+          </w:p>
+          <w:p>
+            <w:pPr>
+              <w:spacing w:after="0" w:line="228"/>
+            </w:pPr>
+            <w:r>
+              <w:rPr>
+                <w:rFonts w:ascii="Courier New" w:cs="Courier New" w:eastAsia="Courier New" w:hAnsi="Courier New"/>
+                <w:color w:val="141413"/>
+                <w:sz w:val="14"/>
+                <w:szCs w:val="14"/>
+              </w:rPr>
+              <w:t xml:space="preserve">- Do NOT spawn sub-agents</w:t>
+            </w:r>
+          </w:p>
+          <w:p>
+            <w:pPr>
+              <w:spacing w:after="0" w:line="228"/>
+            </w:pPr>
+            <w:r>
+              <w:rPr>
+                <w:rFonts w:ascii="Courier New" w:cs="Courier New" w:eastAsia="Courier New" w:hAnsi="Courier New"/>
+                <w:color w:val="141413"/>
+                <w:sz w:val="14"/>
+                <w:szCs w:val="14"/>
+              </w:rPr>
+              <w:t xml:space="preserve">- Do NOT call TaskCreate/TaskUpdate or progress.sh</w:t>
+            </w:r>
+          </w:p>
+          <w:p>
+            <w:pPr>
+              <w:spacing w:after="0" w:line="228"/>
+            </w:pPr>
+            <w:r>
+              <w:rPr>
+                <w:rFonts w:ascii="Courier New" w:cs="Courier New" w:eastAsia="Courier New" w:hAnsi="Courier New"/>
+                <w:color w:val="141413"/>
+                <w:sz w:val="14"/>
+                <w:szCs w:val="14"/>
+              </w:rPr>
+              <w:t xml:space="preserve">- Report results with absolute file paths and counts</w:t>
+            </w:r>
+          </w:p>
+        </w:tc>
+      </w:tr>
+    </w:tbl>
+    <w:p>
+      <w:pPr>
+        <w:spacing w:after="160"/>
+      </w:pPr>
     </w:p>
     <w:p>
       <w:pPr>
@@ -3692,13 +3700,13 @@
           <w:sz w:val="21"/>
           <w:szCs w:val="21"/>
         </w:rPr>
-        <w:t xml:space="preserve">Scope control did more than any clever wording. The preamble, plus one brief per role, is why 59 agents could run against one repository without a merge conflict.</w:t>
+        <w:t xml:space="preserve">This preamble and one brief per role are the reason 59 agents could run against one repository without a merge conflict.</w:t>
       </w:r>
     </w:p>
     <w:p>
       <w:pPr>
         <w:keepNext/>
-        <w:spacing w:before="160" w:after="40"/>
+        <w:spacing w:before="200" w:after="60"/>
       </w:pPr>
       <w:r>
         <w:rPr>
@@ -3712,28 +3720,68 @@
         <w:t xml:space="preserve">Part 1 blind reader (paths shortened for the page)</w:t>
       </w:r>
     </w:p>
-    <w:p>
-      <w:pPr>
-        <w:keepNext w:val="false"/>
-        <w:keepLines/>
-        <w:shd w:fill="F0EEE6" w:color="auto" w:val="clear"/>
-        <w:spacing w:before="0" w:after="200" w:line="250"/>
-        <w:ind w:left="200" w:right="200"/>
-      </w:pPr>
-      <w:r>
-        <w:rPr>
-          <w:rFonts w:ascii="Courier New" w:cs="Courier New" w:eastAsia="Courier New" w:hAnsi="Courier New"/>
-          <w:color w:val="141413"/>
-          <w:sz w:val="15"/>
-          <w:szCs w:val="15"/>
-        </w:rPr>
-        <w:t xml:space="preserve">TASK: You are the blind reader for ticker AMGN (Amgen). First read, in full, docs/part1/BLIND_READER_BRIEF.md and follow every rule in it, especially the DO NOT READ list (no prior-run files, no league/findings/nuggets/needle/handoff docs, no other worktrees). Then read the case PDF and rubric it names. Then walk all eight hiding places for AMGN using the citation index and verified tables, and write out/part1/_blind/AMGN/candidates.jsonl and reader_summary.md exactly in the brief's output contract. Verify every quote with verify_quote before writing it. Report the file paths, the number of candidates and no-finding records, and any data gaps.</w:t>
-      </w:r>
+    <w:tbl>
+      <w:tblPr>
+        <w:tblW w:type="dxa" w:w="9648"/>
+        <w:tblBorders>
+          <w:top w:val="single" w:color="auto" w:sz="4"/>
+          <w:left w:val="single" w:color="auto" w:sz="4"/>
+          <w:bottom w:val="single" w:color="auto" w:sz="4"/>
+          <w:right w:val="single" w:color="auto" w:sz="4"/>
+          <w:insideH w:val="single" w:color="auto" w:sz="4"/>
+          <w:insideV w:val="single" w:color="auto" w:sz="4"/>
+        </w:tblBorders>
+      </w:tblPr>
+      <w:tblGrid>
+        <w:gridCol w:w="9648"/>
+      </w:tblGrid>
+      <w:tr>
+        <w:trPr>
+          <w:cantSplit/>
+        </w:trPr>
+        <w:tc>
+          <w:tcPr>
+            <w:tcW w:type="dxa" w:w="9648"/>
+            <w:tcBorders>
+              <w:top w:val="none" w:color="FFFFFF" w:sz="0"/>
+              <w:left w:val="none" w:color="FFFFFF" w:sz="0"/>
+              <w:bottom w:val="none" w:color="FFFFFF" w:sz="0"/>
+              <w:right w:val="none" w:color="FFFFFF" w:sz="0"/>
+            </w:tcBorders>
+            <w:shd w:fill="F0EEE6" w:color="auto" w:val="clear"/>
+            <w:tcMar>
+              <w:top w:type="dxa" w:w="120"/>
+              <w:left w:type="dxa" w:w="160"/>
+              <w:bottom w:type="dxa" w:w="120"/>
+              <w:right w:type="dxa" w:w="160"/>
+            </w:tcMar>
+          </w:tcPr>
+          <w:p>
+            <w:pPr>
+              <w:spacing w:after="0" w:line="228"/>
+            </w:pPr>
+            <w:r>
+              <w:rPr>
+                <w:rFonts w:ascii="Courier New" w:cs="Courier New" w:eastAsia="Courier New" w:hAnsi="Courier New"/>
+                <w:color w:val="141413"/>
+                <w:sz w:val="14"/>
+                <w:szCs w:val="14"/>
+              </w:rPr>
+              <w:t xml:space="preserve">TASK: You are the blind reader for ticker AMGN (Amgen). First read, in full, docs/part1/BLIND_READER_BRIEF.md and follow every rule in it, especially the DO NOT READ list (no prior-run files, no league/findings/nuggets/needle/handoff docs, no other worktrees). Then read the case PDF and rubric it names. Then walk all eight hiding places for AMGN using the citation index and verified tables, and write out/part1/_blind/AMGN/candidates.jsonl and reader_summary.md exactly in the brief's output contract. Verify every quote with verify_quote before writing it. Report the file paths, the number of candidates and no-finding records, and any data gaps.</w:t>
+            </w:r>
+          </w:p>
+        </w:tc>
+      </w:tr>
+    </w:tbl>
+    <w:p>
+      <w:pPr>
+        <w:spacing w:after="160"/>
+      </w:pPr>
     </w:p>
     <w:p>
       <w:pPr>
         <w:keepNext/>
-        <w:spacing w:before="160" w:after="40"/>
+        <w:spacing w:before="200" w:after="60"/>
       </w:pPr>
       <w:r>
         <w:rPr>
@@ -3744,31 +3792,71 @@
           <w:sz w:val="18"/>
           <w:szCs w:val="18"/>
         </w:rPr>
-        <w:t xml:space="preserve">Part 1 skeptic, round 1. Generic 'check the math' produced generic verdicts; naming the operands did not.</w:t>
-      </w:r>
-    </w:p>
-    <w:p>
-      <w:pPr>
-        <w:keepNext w:val="false"/>
-        <w:keepLines/>
-        <w:shd w:fill="F0EEE6" w:color="auto" w:val="clear"/>
-        <w:spacing w:before="0" w:after="200" w:line="250"/>
-        <w:ind w:left="200" w:right="200"/>
-      </w:pPr>
-      <w:r>
-        <w:rPr>
-          <w:rFonts w:ascii="Courier New" w:cs="Courier New" w:eastAsia="Courier New" w:hAnsi="Courier New"/>
-          <w:color w:val="141413"/>
-          <w:sz w:val="15"/>
-          <w:szCs w:val="15"/>
-        </w:rPr>
-        <w:t xml:space="preserve">TASK: Round 1 skeptic, lens MATERIALITY AND MATH, ticker AMGN. Read docs/part1/SKEPTIC_BRIEF.md in full and follow it. Input: out/part1/_blind/AMGN/candidates.jsonl (and reader_summary.md). Assume every candidate is wrong until the cited page proves otherwise; open each cited page with get_page yourself. Check especially: the TAVNEOS intangible figure and the "5.6 times sales" and EPS math (is it a gross or net-of-tax number, what share count), the IRS Puerto Rico exposure vs accrual numbers and periods, whether the receivables conclusion (no finding) is right, whether net-price percentages come from a cited page or a raw table, and whether "52% of growth in Other products" is arithmetic on cited lines. Write out/part1/_blind/AMGN/skeptic_materiality_r1.json in the brief's shape. Report the count of refuted vs held and the single biggest math problem you found.</w:t>
-      </w:r>
+        <w:t xml:space="preserve">Part 1 skeptic, round 1. Naming the exact operands to test is what produced specific verdicts.</w:t>
+      </w:r>
+    </w:p>
+    <w:tbl>
+      <w:tblPr>
+        <w:tblW w:type="dxa" w:w="9648"/>
+        <w:tblBorders>
+          <w:top w:val="single" w:color="auto" w:sz="4"/>
+          <w:left w:val="single" w:color="auto" w:sz="4"/>
+          <w:bottom w:val="single" w:color="auto" w:sz="4"/>
+          <w:right w:val="single" w:color="auto" w:sz="4"/>
+          <w:insideH w:val="single" w:color="auto" w:sz="4"/>
+          <w:insideV w:val="single" w:color="auto" w:sz="4"/>
+        </w:tblBorders>
+      </w:tblPr>
+      <w:tblGrid>
+        <w:gridCol w:w="9648"/>
+      </w:tblGrid>
+      <w:tr>
+        <w:trPr>
+          <w:cantSplit/>
+        </w:trPr>
+        <w:tc>
+          <w:tcPr>
+            <w:tcW w:type="dxa" w:w="9648"/>
+            <w:tcBorders>
+              <w:top w:val="none" w:color="FFFFFF" w:sz="0"/>
+              <w:left w:val="none" w:color="FFFFFF" w:sz="0"/>
+              <w:bottom w:val="none" w:color="FFFFFF" w:sz="0"/>
+              <w:right w:val="none" w:color="FFFFFF" w:sz="0"/>
+            </w:tcBorders>
+            <w:shd w:fill="F0EEE6" w:color="auto" w:val="clear"/>
+            <w:tcMar>
+              <w:top w:type="dxa" w:w="120"/>
+              <w:left w:type="dxa" w:w="160"/>
+              <w:bottom w:type="dxa" w:w="120"/>
+              <w:right w:type="dxa" w:w="160"/>
+            </w:tcMar>
+          </w:tcPr>
+          <w:p>
+            <w:pPr>
+              <w:spacing w:after="0" w:line="228"/>
+            </w:pPr>
+            <w:r>
+              <w:rPr>
+                <w:rFonts w:ascii="Courier New" w:cs="Courier New" w:eastAsia="Courier New" w:hAnsi="Courier New"/>
+                <w:color w:val="141413"/>
+                <w:sz w:val="14"/>
+                <w:szCs w:val="14"/>
+              </w:rPr>
+              <w:t xml:space="preserve">TASK: Round 1 skeptic, lens MATERIALITY AND MATH, ticker AMGN. Read docs/part1/SKEPTIC_BRIEF.md in full and follow it. Input: out/part1/_blind/AMGN/candidates.jsonl (and reader_summary.md). Assume every candidate is wrong until the cited page proves otherwise; open each cited page with get_page yourself. Check especially: the TAVNEOS intangible figure and the "5.6 times sales" and EPS math (is it a gross or net-of-tax number, what share count), the IRS Puerto Rico exposure vs accrual numbers and periods, whether the receivables conclusion (no finding) is right, whether net-price percentages come from a cited page or a raw table, and whether "52% of growth in Other products" is arithmetic on cited lines. Write out/part1/_blind/AMGN/skeptic_materiality_r1.json in the brief's shape. Report the count of refuted vs held and the single biggest math problem you found.</w:t>
+            </w:r>
+          </w:p>
+        </w:tc>
+      </w:tr>
+    </w:tbl>
+    <w:p>
+      <w:pPr>
+        <w:spacing w:after="160"/>
+      </w:pPr>
     </w:p>
     <w:p>
       <w:pPr>
         <w:keepNext/>
-        <w:spacing w:before="160" w:after="40"/>
+        <w:spacing w:before="200" w:after="60"/>
       </w:pPr>
       <w:r>
         <w:rPr>
@@ -3779,31 +3867,71 @@
           <w:sz w:val="18"/>
           <w:szCs w:val="18"/>
         </w:rPr>
-        <w:t xml:space="preserve">Part 1 skeptic, round 2. The same agent is resumed so it keeps its notes; it reads the other lens against the pages, not against the summary.</w:t>
-      </w:r>
-    </w:p>
-    <w:p>
-      <w:pPr>
-        <w:keepNext w:val="false"/>
-        <w:keepLines/>
-        <w:shd w:fill="F0EEE6" w:color="auto" w:val="clear"/>
-        <w:spacing w:before="0" w:after="200" w:line="250"/>
-        <w:ind w:left="200" w:right="200"/>
-      </w:pPr>
-      <w:r>
-        <w:rPr>
-          <w:rFonts w:ascii="Courier New" w:cs="Courier New" w:eastAsia="Courier New" w:hAnsi="Courier New"/>
-          <w:color w:val="141413"/>
-          <w:sz w:val="15"/>
-          <w:szCs w:val="15"/>
-        </w:rPr>
-        <w:t xml:space="preserve">Round 2, same lens (MATERIALITY AND MATH), ticker AMGN. The other skeptic, on the OBVIOUSNESS lens, has written out/part1/_blind/AMGN/skeptic_obviousness_r1.json. Read their argument AGAINST THE SOURCES (open the pages they cite with get_page). Concede what they got right, hold what you still believe with a reason, and narrow your claim if it was too broad. Do not restate round 1. In particular: they held c03 (TEPEZZA: the Q1 2026 10-Q says 22 of 29 growth points were channel inventory while the call credited demand) as least obvious, which you refuted as too small and contradicted by Q2; settle whether a channel-inventory-vs-demand discrepancy on a roughly $2B product is material. They held c06 narrowed (TAVNEOS carrying value about 5x sales, GAAP-only, FDA withdrawal request reported on the 2026Q2 call but not in the 10-Q note), c02 narrowed to the filings-only 54% deduction rate and 30% accrual build with new "timing of payments" wording, and c08 narrowed to the unflagged $130M Q2 2026 true-ups; they killed c05 (the accrual gap was answered in 2024Q2 and 2026Q1 Q&amp;A) and c10 (the $2.5B U.S. capex undercuts "no pledge"). Size the narrowed c02, c06 and c08 versions on your math. Write out/part1/_blind/AMGN/skeptic_materiality_r2.json in the SKEPTIC_BRIEF round-2 shape (each verdict carries round2: {conceded, held, narrowed}). Report what changed between your rounds.</w:t>
-      </w:r>
+        <w:t xml:space="preserve">Part 1 skeptic, round 2. The same agent is resumed so it keeps its notes, and it checks the other lens against the cited pages.</w:t>
+      </w:r>
+    </w:p>
+    <w:tbl>
+      <w:tblPr>
+        <w:tblW w:type="dxa" w:w="9648"/>
+        <w:tblBorders>
+          <w:top w:val="single" w:color="auto" w:sz="4"/>
+          <w:left w:val="single" w:color="auto" w:sz="4"/>
+          <w:bottom w:val="single" w:color="auto" w:sz="4"/>
+          <w:right w:val="single" w:color="auto" w:sz="4"/>
+          <w:insideH w:val="single" w:color="auto" w:sz="4"/>
+          <w:insideV w:val="single" w:color="auto" w:sz="4"/>
+        </w:tblBorders>
+      </w:tblPr>
+      <w:tblGrid>
+        <w:gridCol w:w="9648"/>
+      </w:tblGrid>
+      <w:tr>
+        <w:trPr>
+          <w:cantSplit/>
+        </w:trPr>
+        <w:tc>
+          <w:tcPr>
+            <w:tcW w:type="dxa" w:w="9648"/>
+            <w:tcBorders>
+              <w:top w:val="none" w:color="FFFFFF" w:sz="0"/>
+              <w:left w:val="none" w:color="FFFFFF" w:sz="0"/>
+              <w:bottom w:val="none" w:color="FFFFFF" w:sz="0"/>
+              <w:right w:val="none" w:color="FFFFFF" w:sz="0"/>
+            </w:tcBorders>
+            <w:shd w:fill="F0EEE6" w:color="auto" w:val="clear"/>
+            <w:tcMar>
+              <w:top w:type="dxa" w:w="120"/>
+              <w:left w:type="dxa" w:w="160"/>
+              <w:bottom w:type="dxa" w:w="120"/>
+              <w:right w:type="dxa" w:w="160"/>
+            </w:tcMar>
+          </w:tcPr>
+          <w:p>
+            <w:pPr>
+              <w:spacing w:after="0" w:line="228"/>
+            </w:pPr>
+            <w:r>
+              <w:rPr>
+                <w:rFonts w:ascii="Courier New" w:cs="Courier New" w:eastAsia="Courier New" w:hAnsi="Courier New"/>
+                <w:color w:val="141413"/>
+                <w:sz w:val="14"/>
+                <w:szCs w:val="14"/>
+              </w:rPr>
+              <w:t xml:space="preserve">Round 2, same lens (MATERIALITY AND MATH), ticker AMGN. The other skeptic, on the OBVIOUSNESS lens, has written out/part1/_blind/AMGN/skeptic_obviousness_r1.json. Read their argument AGAINST THE SOURCES (open the pages they cite with get_page). Concede what they got right, hold what you still believe with a reason, and narrow your claim if it was too broad. Do not restate round 1. In particular: they held c03 (TEPEZZA: the Q1 2026 10-Q says 22 of 29 growth points were channel inventory while the call credited demand) as least obvious, which you refuted as too small and contradicted by Q2; settle whether a channel-inventory-vs-demand discrepancy on a roughly $2B product is material. They held c06 narrowed (TAVNEOS carrying value about 5x sales, GAAP-only, FDA withdrawal request reported on the 2026Q2 call but not in the 10-Q note), c02 narrowed to the filings-only 54% deduction rate and 30% accrual build with new "timing of payments" wording, and c08 narrowed to the unflagged $130M Q2 2026 true-ups; they killed c05 (the accrual gap was answered in 2024Q2 and 2026Q1 Q&amp;A) and c10 (the $2.5B U.S. capex undercuts "no pledge"). Size the narrowed c02, c06 and c08 versions on your math. Write out/part1/_blind/AMGN/skeptic_materiality_r2.json in the SKEPTIC_BRIEF round-2 shape (each verdict carries round2: {conceded, held, narrowed}). Report what changed between your rounds.</w:t>
+            </w:r>
+          </w:p>
+        </w:tc>
+      </w:tr>
+    </w:tbl>
+    <w:p>
+      <w:pPr>
+        <w:spacing w:after="160"/>
+      </w:pPr>
     </w:p>
     <w:p>
       <w:pPr>
         <w:keepNext/>
-        <w:spacing w:before="160" w:after="40"/>
+        <w:spacing w:before="200" w:after="60"/>
       </w:pPr>
       <w:r>
         <w:rPr>
@@ -3817,28 +3945,68 @@
         <w:t xml:space="preserve">Part 1 independent verifier</w:t>
       </w:r>
     </w:p>
-    <w:p>
-      <w:pPr>
-        <w:keepNext w:val="false"/>
-        <w:keepLines/>
-        <w:shd w:fill="F0EEE6" w:color="auto" w:val="clear"/>
-        <w:spacing w:before="0" w:after="200" w:line="250"/>
-        <w:ind w:left="200" w:right="200"/>
-      </w:pPr>
-      <w:r>
-        <w:rPr>
-          <w:rFonts w:ascii="Courier New" w:cs="Courier New" w:eastAsia="Courier New" w:hAnsi="Courier New"/>
-          <w:color w:val="141413"/>
-          <w:sz w:val="15"/>
-          <w:szCs w:val="15"/>
-        </w:rPr>
-        <w:t xml:space="preserve">TASK: Independent verifier for the three Part 1 deliverables. Assume every number is WRONG until the cited page proves it. Do not read the writers' reports or scripts; read only the output files and the sources. Files: out/part1/{AMGN,MRK,PFE}/part1.json. Sources: the citation index via agent/moat/cite.py (get_page(doc_id, page) and verify_quote). For each company: (1) for every finding row, open every cite in cites and confirm the quote is on the page (verify_quote) and that each number in finding, impact.text and impact.math is either inside a quoted span, equal to a cite's own value, labelled [derived] with operands that are themselves cited and whose arithmetic you reproduce, or labelled [assumption]; (2) for the Sharpest Needle "why" and the product_table financial_tie, growth_limiter and priced_in texts, do the same; (3) sample 6 product cells per company (at least one per row key) and check the quoted label or table text is on the page; (4) check that no sentence states as fact a number the blind skeptics refuted (read out/part1/_blind/&lt;T&gt;/synthesis.json rulings for the ids used); (5) check currency labels and that no Bloomberg-licensed page is quoted. Write out/part1/verify_report.md with a table per company (row or cell, what you checked, pass or fail, the exact defect) and a summary line with counts. Do not edit the part1 files. Report the fail count per company and the single worst defect.</w:t>
-      </w:r>
+    <w:tbl>
+      <w:tblPr>
+        <w:tblW w:type="dxa" w:w="9648"/>
+        <w:tblBorders>
+          <w:top w:val="single" w:color="auto" w:sz="4"/>
+          <w:left w:val="single" w:color="auto" w:sz="4"/>
+          <w:bottom w:val="single" w:color="auto" w:sz="4"/>
+          <w:right w:val="single" w:color="auto" w:sz="4"/>
+          <w:insideH w:val="single" w:color="auto" w:sz="4"/>
+          <w:insideV w:val="single" w:color="auto" w:sz="4"/>
+        </w:tblBorders>
+      </w:tblPr>
+      <w:tblGrid>
+        <w:gridCol w:w="9648"/>
+      </w:tblGrid>
+      <w:tr>
+        <w:trPr>
+          <w:cantSplit/>
+        </w:trPr>
+        <w:tc>
+          <w:tcPr>
+            <w:tcW w:type="dxa" w:w="9648"/>
+            <w:tcBorders>
+              <w:top w:val="none" w:color="FFFFFF" w:sz="0"/>
+              <w:left w:val="none" w:color="FFFFFF" w:sz="0"/>
+              <w:bottom w:val="none" w:color="FFFFFF" w:sz="0"/>
+              <w:right w:val="none" w:color="FFFFFF" w:sz="0"/>
+            </w:tcBorders>
+            <w:shd w:fill="F0EEE6" w:color="auto" w:val="clear"/>
+            <w:tcMar>
+              <w:top w:type="dxa" w:w="120"/>
+              <w:left w:type="dxa" w:w="160"/>
+              <w:bottom w:type="dxa" w:w="120"/>
+              <w:right w:type="dxa" w:w="160"/>
+            </w:tcMar>
+          </w:tcPr>
+          <w:p>
+            <w:pPr>
+              <w:spacing w:after="0" w:line="228"/>
+            </w:pPr>
+            <w:r>
+              <w:rPr>
+                <w:rFonts w:ascii="Courier New" w:cs="Courier New" w:eastAsia="Courier New" w:hAnsi="Courier New"/>
+                <w:color w:val="141413"/>
+                <w:sz w:val="14"/>
+                <w:szCs w:val="14"/>
+              </w:rPr>
+              <w:t xml:space="preserve">TASK: Independent verifier for the three Part 1 deliverables. Assume every number is WRONG until the cited page proves it. Do not read the writers' reports or scripts; read only the output files and the sources. Files: out/part1/{AMGN,MRK,PFE}/part1.json. Sources: the citation index via agent/moat/cite.py (get_page(doc_id, page) and verify_quote). For each company: (1) for every finding row, open every cite in cites and confirm the quote is on the page (verify_quote) and that each number in finding, impact.text and impact.math is either inside a quoted span, equal to a cite's own value, labelled [derived] with operands that are themselves cited and whose arithmetic you reproduce, or labelled [assumption]; (2) for the Sharpest Needle "why" and the product_table financial_tie, growth_limiter and priced_in texts, do the same; (3) sample 6 product cells per company (at least one per row key) and check the quoted label or table text is on the page; (4) check that no sentence states as fact a number the blind skeptics refuted (read out/part1/_blind/&lt;T&gt;/synthesis.json rulings for the ids used); (5) check currency labels and that no Bloomberg-licensed page is quoted. Write out/part1/verify_report.md with a table per company (row or cell, what you checked, pass or fail, the exact defect) and a summary line with counts. Do not edit the part1 files. Report the fail count per company and the single worst defect.</w:t>
+            </w:r>
+          </w:p>
+        </w:tc>
+      </w:tr>
+    </w:tbl>
+    <w:p>
+      <w:pPr>
+        <w:spacing w:after="160"/>
+      </w:pPr>
     </w:p>
     <w:p>
       <w:pPr>
         <w:keepNext/>
-        <w:spacing w:before="160" w:after="40"/>
+        <w:spacing w:before="200" w:after="60"/>
       </w:pPr>
       <w:r>
         <w:rPr>
@@ -3852,28 +4020,68 @@
         <w:t xml:space="preserve">Part 2 strategist</w:t>
       </w:r>
     </w:p>
-    <w:p>
-      <w:pPr>
-        <w:keepNext w:val="false"/>
-        <w:keepLines/>
-        <w:shd w:fill="F0EEE6" w:color="auto" w:val="clear"/>
-        <w:spacing w:before="0" w:after="200" w:line="250"/>
-        <w:ind w:left="200" w:right="200"/>
-      </w:pPr>
-      <w:r>
-        <w:rPr>
-          <w:rFonts w:ascii="Courier New" w:cs="Courier New" w:eastAsia="Courier New" w:hAnsi="Courier New"/>
-          <w:color w:val="141413"/>
-          <w:sz w:val="15"/>
-          <w:szCs w:val="15"/>
-        </w:rPr>
-        <w:t xml:space="preserve">TASK: You are the Part 2 STRATEGIST for ticker AMGN (Amgen). First read, in full, docs/part2/STRATEGIST_BRIEF.md and follow every rule in it: the READ ONLY list, the DO NOT READ list, the index interpreter and usage, the citation rules, the Python-only writing rule and the grep check. Then read the case PDF's Part 2 section and the rubric, then out/part1/AMGN/part1.json and part1.md. Propose at least four candidate moves of at least two types, each costed with cited math, written to out/part2/_work/AMGN/candidates.jsonl in the brief's exact contract, plus strategist_summary.md and data_requests.md. The skeptics default to kill, so every number must trace to a cited page or carry [assumption]; a move management has already announced is obvious and must be marked so in already_announced_check. Work to disk as you go. Finish within about 40 minutes of work; depth on four well-evidenced moves beats six thin ones. Report the candidate ids, types, cost and return amounts, and the data gaps.</w:t>
-      </w:r>
+    <w:tbl>
+      <w:tblPr>
+        <w:tblW w:type="dxa" w:w="9648"/>
+        <w:tblBorders>
+          <w:top w:val="single" w:color="auto" w:sz="4"/>
+          <w:left w:val="single" w:color="auto" w:sz="4"/>
+          <w:bottom w:val="single" w:color="auto" w:sz="4"/>
+          <w:right w:val="single" w:color="auto" w:sz="4"/>
+          <w:insideH w:val="single" w:color="auto" w:sz="4"/>
+          <w:insideV w:val="single" w:color="auto" w:sz="4"/>
+        </w:tblBorders>
+      </w:tblPr>
+      <w:tblGrid>
+        <w:gridCol w:w="9648"/>
+      </w:tblGrid>
+      <w:tr>
+        <w:trPr>
+          <w:cantSplit/>
+        </w:trPr>
+        <w:tc>
+          <w:tcPr>
+            <w:tcW w:type="dxa" w:w="9648"/>
+            <w:tcBorders>
+              <w:top w:val="none" w:color="FFFFFF" w:sz="0"/>
+              <w:left w:val="none" w:color="FFFFFF" w:sz="0"/>
+              <w:bottom w:val="none" w:color="FFFFFF" w:sz="0"/>
+              <w:right w:val="none" w:color="FFFFFF" w:sz="0"/>
+            </w:tcBorders>
+            <w:shd w:fill="F0EEE6" w:color="auto" w:val="clear"/>
+            <w:tcMar>
+              <w:top w:type="dxa" w:w="120"/>
+              <w:left w:type="dxa" w:w="160"/>
+              <w:bottom w:type="dxa" w:w="120"/>
+              <w:right w:type="dxa" w:w="160"/>
+            </w:tcMar>
+          </w:tcPr>
+          <w:p>
+            <w:pPr>
+              <w:spacing w:after="0" w:line="228"/>
+            </w:pPr>
+            <w:r>
+              <w:rPr>
+                <w:rFonts w:ascii="Courier New" w:cs="Courier New" w:eastAsia="Courier New" w:hAnsi="Courier New"/>
+                <w:color w:val="141413"/>
+                <w:sz w:val="14"/>
+                <w:szCs w:val="14"/>
+              </w:rPr>
+              <w:t xml:space="preserve">TASK: You are the Part 2 STRATEGIST for ticker AMGN (Amgen). First read, in full, docs/part2/STRATEGIST_BRIEF.md and follow every rule in it: the READ ONLY list, the DO NOT READ list, the index interpreter and usage, the citation rules, the Python-only writing rule and the grep check. Then read the case PDF's Part 2 section and the rubric, then out/part1/AMGN/part1.json and part1.md. Propose at least four candidate moves of at least two types, each costed with cited math, written to out/part2/_work/AMGN/candidates.jsonl in the brief's exact contract, plus strategist_summary.md and data_requests.md. The skeptics default to kill, so every number must trace to a cited page or carry [assumption]; a move management has already announced is obvious and must be marked so in already_announced_check. Work to disk as you go. Finish within about 40 minutes of work; depth on four well-evidenced moves beats six thin ones. Report the candidate ids, types, cost and return amounts, and the data gaps.</w:t>
+            </w:r>
+          </w:p>
+        </w:tc>
+      </w:tr>
+    </w:tbl>
+    <w:p>
+      <w:pPr>
+        <w:spacing w:after="160"/>
+      </w:pPr>
     </w:p>
     <w:p>
       <w:pPr>
         <w:keepNext/>
-        <w:spacing w:before="160" w:after="40"/>
+        <w:spacing w:before="200" w:after="60"/>
       </w:pPr>
       <w:r>
         <w:rPr>
@@ -3887,28 +4095,68 @@
         <w:t xml:space="preserve">From the Part 2 synthesizer prompt. The orchestrator's summary is a pointer, not evidence.</w:t>
       </w:r>
     </w:p>
-    <w:p>
-      <w:pPr>
-        <w:keepNext w:val="false"/>
-        <w:keepLines/>
-        <w:shd w:fill="F0EEE6" w:color="auto" w:val="clear"/>
-        <w:spacing w:before="0" w:after="200" w:line="250"/>
-        <w:ind w:left="200" w:right="200"/>
-      </w:pPr>
-      <w:r>
-        <w:rPr>
-          <w:rFonts w:ascii="Courier New" w:cs="Courier New" w:eastAsia="Courier New" w:hAnsi="Courier New"/>
-          <w:color w:val="141413"/>
-          <w:sz w:val="15"/>
-          <w:szCs w:val="15"/>
-        </w:rPr>
-        <w:t xml:space="preserve">What the skeptics concluded (verify against their files, do not trust this summary): all four AMGN candidates refuted as written; after round 2 both lenses name the same narrowed survivor: m01 in gated form, a $10M to $15M [assumption] hearing-record offer to the FDA ... Unresolved: whether the FDA's postmarketing-requirement path has real probability given the untrue-statements ground; whether m02's lift is unsourced or uncreditable; gross vs net rebate basis; UCB's walk-away price. Record them in unresolved[] as the two positions, never averaged.</w:t>
-      </w:r>
+    <w:tbl>
+      <w:tblPr>
+        <w:tblW w:type="dxa" w:w="9648"/>
+        <w:tblBorders>
+          <w:top w:val="single" w:color="auto" w:sz="4"/>
+          <w:left w:val="single" w:color="auto" w:sz="4"/>
+          <w:bottom w:val="single" w:color="auto" w:sz="4"/>
+          <w:right w:val="single" w:color="auto" w:sz="4"/>
+          <w:insideH w:val="single" w:color="auto" w:sz="4"/>
+          <w:insideV w:val="single" w:color="auto" w:sz="4"/>
+        </w:tblBorders>
+      </w:tblPr>
+      <w:tblGrid>
+        <w:gridCol w:w="9648"/>
+      </w:tblGrid>
+      <w:tr>
+        <w:trPr>
+          <w:cantSplit/>
+        </w:trPr>
+        <w:tc>
+          <w:tcPr>
+            <w:tcW w:type="dxa" w:w="9648"/>
+            <w:tcBorders>
+              <w:top w:val="none" w:color="FFFFFF" w:sz="0"/>
+              <w:left w:val="none" w:color="FFFFFF" w:sz="0"/>
+              <w:bottom w:val="none" w:color="FFFFFF" w:sz="0"/>
+              <w:right w:val="none" w:color="FFFFFF" w:sz="0"/>
+            </w:tcBorders>
+            <w:shd w:fill="F0EEE6" w:color="auto" w:val="clear"/>
+            <w:tcMar>
+              <w:top w:type="dxa" w:w="120"/>
+              <w:left w:type="dxa" w:w="160"/>
+              <w:bottom w:type="dxa" w:w="120"/>
+              <w:right w:type="dxa" w:w="160"/>
+            </w:tcMar>
+          </w:tcPr>
+          <w:p>
+            <w:pPr>
+              <w:spacing w:after="0" w:line="228"/>
+            </w:pPr>
+            <w:r>
+              <w:rPr>
+                <w:rFonts w:ascii="Courier New" w:cs="Courier New" w:eastAsia="Courier New" w:hAnsi="Courier New"/>
+                <w:color w:val="141413"/>
+                <w:sz w:val="14"/>
+                <w:szCs w:val="14"/>
+              </w:rPr>
+              <w:t xml:space="preserve">What the skeptics concluded (verify against their files, do not trust this summary): all four AMGN candidates refuted as written; after round 2 both lenses name the same narrowed survivor: m01 in gated form, a $10M to $15M [assumption] hearing-record offer to the FDA ... Unresolved: whether the FDA's postmarketing-requirement path has real probability given the untrue-statements ground; whether m02's lift is unsourced or uncreditable; gross vs net rebate basis; UCB's walk-away price. Record them in unresolved[] as the two positions, never averaged.</w:t>
+            </w:r>
+          </w:p>
+        </w:tc>
+      </w:tr>
+    </w:tbl>
+    <w:p>
+      <w:pPr>
+        <w:spacing w:after="160"/>
+      </w:pPr>
     </w:p>
     <w:p>
       <w:pPr>
         <w:keepNext/>
-        <w:spacing w:before="160" w:after="40"/>
+        <w:spacing w:before="200" w:after="60"/>
       </w:pPr>
       <w:r>
         <w:rPr>
@@ -3922,23 +4170,63 @@
         <w:t xml:space="preserve">The citation system rule, appended to every cited model call. The last sentence is true: the gate deletes it.</w:t>
       </w:r>
     </w:p>
-    <w:p>
-      <w:pPr>
-        <w:keepNext w:val="false"/>
-        <w:keepLines/>
-        <w:shd w:fill="F0EEE6" w:color="auto" w:val="clear"/>
-        <w:spacing w:before="0" w:after="200" w:line="250"/>
-        <w:ind w:left="200" w:right="200"/>
-      </w:pPr>
-      <w:r>
-        <w:rPr>
-          <w:rFonts w:ascii="Courier New" w:cs="Courier New" w:eastAsia="Courier New" w:hAnsi="Courier New"/>
-          <w:color w:val="141413"/>
-          <w:sz w:val="15"/>
-          <w:szCs w:val="15"/>
-        </w:rPr>
-        <w:t xml:space="preserve">Every number and every quotation in your answer must carry a citation to one of the provided source blocks. Quote figures exactly as they appear in the source (same digits, same units). Write one claim per sentence and cite each sentence that contains a number or a factual assertion. If the sources do not contain the fact, write "not found in the provided sources" instead of guessing. Never compute or round a figure that is not printed on a source page unless you show the calculation with each operand cited. Never invent, infer, or state page numbers or document names yourself; page references come only from the citations. Any sentence containing a number or quote that has no citation will be deleted before the reader sees it.</w:t>
-      </w:r>
+    <w:tbl>
+      <w:tblPr>
+        <w:tblW w:type="dxa" w:w="9648"/>
+        <w:tblBorders>
+          <w:top w:val="single" w:color="auto" w:sz="4"/>
+          <w:left w:val="single" w:color="auto" w:sz="4"/>
+          <w:bottom w:val="single" w:color="auto" w:sz="4"/>
+          <w:right w:val="single" w:color="auto" w:sz="4"/>
+          <w:insideH w:val="single" w:color="auto" w:sz="4"/>
+          <w:insideV w:val="single" w:color="auto" w:sz="4"/>
+        </w:tblBorders>
+      </w:tblPr>
+      <w:tblGrid>
+        <w:gridCol w:w="9648"/>
+      </w:tblGrid>
+      <w:tr>
+        <w:trPr>
+          <w:cantSplit/>
+        </w:trPr>
+        <w:tc>
+          <w:tcPr>
+            <w:tcW w:type="dxa" w:w="9648"/>
+            <w:tcBorders>
+              <w:top w:val="none" w:color="FFFFFF" w:sz="0"/>
+              <w:left w:val="none" w:color="FFFFFF" w:sz="0"/>
+              <w:bottom w:val="none" w:color="FFFFFF" w:sz="0"/>
+              <w:right w:val="none" w:color="FFFFFF" w:sz="0"/>
+            </w:tcBorders>
+            <w:shd w:fill="F0EEE6" w:color="auto" w:val="clear"/>
+            <w:tcMar>
+              <w:top w:type="dxa" w:w="120"/>
+              <w:left w:type="dxa" w:w="160"/>
+              <w:bottom w:type="dxa" w:w="120"/>
+              <w:right w:type="dxa" w:w="160"/>
+            </w:tcMar>
+          </w:tcPr>
+          <w:p>
+            <w:pPr>
+              <w:spacing w:after="0" w:line="228"/>
+            </w:pPr>
+            <w:r>
+              <w:rPr>
+                <w:rFonts w:ascii="Courier New" w:cs="Courier New" w:eastAsia="Courier New" w:hAnsi="Courier New"/>
+                <w:color w:val="141413"/>
+                <w:sz w:val="14"/>
+                <w:szCs w:val="14"/>
+              </w:rPr>
+              <w:t xml:space="preserve">Every number and every quotation in your answer must carry a citation to one of the provided source blocks. Quote figures exactly as they appear in the source (same digits, same units). Write one claim per sentence and cite each sentence that contains a number or a factual assertion. If the sources do not contain the fact, write "not found in the provided sources" instead of guessing. Never compute or round a figure that is not printed on a source page unless you show the calculation with each operand cited. Never invent, infer, or state page numbers or document names yourself; page references come only from the citations. Any sentence containing a number or quote that has no citation will be deleted before the reader sees it.</w:t>
+            </w:r>
+          </w:p>
+        </w:tc>
+      </w:tr>
+    </w:tbl>
+    <w:p>
+      <w:pPr>
+        <w:spacing w:after="160"/>
+      </w:pPr>
     </w:p>
     <w:p>
       <w:pPr>
@@ -3951,7 +4239,7 @@
           <w:sz w:val="21"/>
           <w:szCs w:val="21"/>
         </w:rPr>
-        <w:t xml:space="preserve">One more sentence did a great deal of work earlier in the weekend, when two reviewer agents were set on our own model code: 'Assume the claim is WRONG until the code proves otherwise.' Applied to the first backtest, it killed a result we had been pleased with (Section 5, case 1).</w:t>
+        <w:t xml:space="preserve">We used one more sentence earlier in the weekend, when we set two reviewer agents on our own model code: 'Assume the claim is WRONG until the code proves otherwise.' Applied to the first backtest, it killed a result we had been pleased with (Section 5, case 1).</w:t>
       </w:r>
     </w:p>
     <w:p>
@@ -3980,7 +4268,7 @@
           <w:sz w:val="38"/>
           <w:szCs w:val="38"/>
         </w:rPr>
-        <w:t xml:space="preserve">5. Where the AI was confidently wrong, and how we caught it</w:t>
+        <w:t xml:space="preserve">5. Where the AI was confidently wrong</w:t>
       </w:r>
     </w:p>
     <w:p>
@@ -4039,7 +4327,7 @@
           </w:tcPr>
           <w:p>
             <w:pPr>
-              <w:spacing w:after="0" w:line="250"/>
+              <w:spacing w:after="0" w:line="220"/>
             </w:pPr>
             <w:r>
               <w:rPr>
@@ -4074,7 +4362,7 @@
           </w:tcPr>
           <w:p>
             <w:pPr>
-              <w:spacing w:after="0" w:line="250"/>
+              <w:spacing w:after="0" w:line="220"/>
             </w:pPr>
             <w:r>
               <w:rPr>
@@ -4109,7 +4397,7 @@
           </w:tcPr>
           <w:p>
             <w:pPr>
-              <w:spacing w:after="0" w:line="250"/>
+              <w:spacing w:after="0" w:line="220"/>
             </w:pPr>
             <w:r>
               <w:rPr>
@@ -4144,7 +4432,7 @@
           </w:tcPr>
           <w:p>
             <w:pPr>
-              <w:spacing w:after="0" w:line="250"/>
+              <w:spacing w:after="0" w:line="220"/>
             </w:pPr>
             <w:r>
               <w:rPr>
@@ -4183,7 +4471,7 @@
           </w:tcPr>
           <w:p>
             <w:pPr>
-              <w:spacing w:after="0" w:line="250"/>
+              <w:spacing w:after="0" w:line="220"/>
             </w:pPr>
             <w:r>
               <w:rPr>
@@ -4194,7 +4482,7 @@
                 <w:sz w:val="16"/>
                 <w:szCs w:val="16"/>
               </w:rPr>
-              <w:t xml:space="preserve">Lilly led the company ranking; its gross margin implied about $68B of impact, 80 percent of its score.</w:t>
+              <w:t xml:space="preserve">Lilly led the company ranking. Its gross margin implied about $68B of impact, 80 percent of its score.</w:t>
             </w:r>
           </w:p>
         </w:tc>
@@ -4217,7 +4505,7 @@
           </w:tcPr>
           <w:p>
             <w:pPr>
-              <w:spacing w:after="0" w:line="250"/>
+              <w:spacing w:after="0" w:line="220"/>
             </w:pPr>
             <w:r>
               <w:rPr>
@@ -4251,7 +4539,7 @@
           </w:tcPr>
           <w:p>
             <w:pPr>
-              <w:spacing w:after="0" w:line="250"/>
+              <w:spacing w:after="0" w:line="220"/>
             </w:pPr>
             <w:r>
               <w:rPr>
@@ -4285,7 +4573,7 @@
           </w:tcPr>
           <w:p>
             <w:pPr>
-              <w:spacing w:after="0" w:line="250"/>
+              <w:spacing w:after="0" w:line="220"/>
             </w:pPr>
             <w:r>
               <w:rPr>
@@ -4324,7 +4612,7 @@
           </w:tcPr>
           <w:p>
             <w:pPr>
-              <w:spacing w:after="0" w:line="250"/>
+              <w:spacing w:after="0" w:line="220"/>
             </w:pPr>
             <w:r>
               <w:rPr>
@@ -4358,7 +4646,7 @@
           </w:tcPr>
           <w:p>
             <w:pPr>
-              <w:spacing w:after="0" w:line="250"/>
+              <w:spacing w:after="0" w:line="220"/>
             </w:pPr>
             <w:r>
               <w:rPr>
@@ -4392,7 +4680,7 @@
           </w:tcPr>
           <w:p>
             <w:pPr>
-              <w:spacing w:after="0" w:line="250"/>
+              <w:spacing w:after="0" w:line="220"/>
             </w:pPr>
             <w:r>
               <w:rPr>
@@ -4426,7 +4714,7 @@
           </w:tcPr>
           <w:p>
             <w:pPr>
-              <w:spacing w:after="0" w:line="250"/>
+              <w:spacing w:after="0" w:line="220"/>
             </w:pPr>
             <w:r>
               <w:rPr>
@@ -4465,7 +4753,7 @@
           </w:tcPr>
           <w:p>
             <w:pPr>
-              <w:spacing w:after="0" w:line="250"/>
+              <w:spacing w:after="0" w:line="220"/>
             </w:pPr>
             <w:r>
               <w:rPr>
@@ -4476,7 +4764,7 @@
                 <w:sz w:val="16"/>
                 <w:szCs w:val="16"/>
               </w:rPr>
-              <w:t xml:space="preserve">Amgen needle from the ratio code: receivables growing faster than revenue, a collections flag.</w:t>
+              <w:t xml:space="preserve">The ratio code's Amgen needle, receivables growing faster than revenue, read as a collections flag.</w:t>
             </w:r>
           </w:p>
         </w:tc>
@@ -4499,7 +4787,7 @@
           </w:tcPr>
           <w:p>
             <w:pPr>
-              <w:spacing w:after="0" w:line="250"/>
+              <w:spacing w:after="0" w:line="220"/>
             </w:pPr>
             <w:r>
               <w:rPr>
@@ -4533,7 +4821,7 @@
           </w:tcPr>
           <w:p>
             <w:pPr>
-              <w:spacing w:after="0" w:line="250"/>
+              <w:spacing w:after="0" w:line="220"/>
             </w:pPr>
             <w:r>
               <w:rPr>
@@ -4567,7 +4855,7 @@
           </w:tcPr>
           <w:p>
             <w:pPr>
-              <w:spacing w:after="0" w:line="250"/>
+              <w:spacing w:after="0" w:line="220"/>
             </w:pPr>
             <w:r>
               <w:rPr>
@@ -4606,7 +4894,7 @@
           </w:tcPr>
           <w:p>
             <w:pPr>
-              <w:spacing w:after="0" w:line="250"/>
+              <w:spacing w:after="0" w:line="220"/>
             </w:pPr>
             <w:r>
               <w:rPr>
@@ -4640,7 +4928,7 @@
           </w:tcPr>
           <w:p>
             <w:pPr>
-              <w:spacing w:after="0" w:line="250"/>
+              <w:spacing w:after="0" w:line="220"/>
             </w:pPr>
             <w:r>
               <w:rPr>
@@ -4674,7 +4962,7 @@
           </w:tcPr>
           <w:p>
             <w:pPr>
-              <w:spacing w:after="0" w:line="250"/>
+              <w:spacing w:after="0" w:line="220"/>
             </w:pPr>
             <w:r>
               <w:rPr>
@@ -4708,7 +4996,7 @@
           </w:tcPr>
           <w:p>
             <w:pPr>
-              <w:spacing w:after="0" w:line="250"/>
+              <w:spacing w:after="0" w:line="220"/>
             </w:pPr>
             <w:r>
               <w:rPr>
@@ -4747,7 +5035,7 @@
           </w:tcPr>
           <w:p>
             <w:pPr>
-              <w:spacing w:after="0" w:line="250"/>
+              <w:spacing w:after="0" w:line="220"/>
             </w:pPr>
             <w:r>
               <w:rPr>
@@ -4781,7 +5069,7 @@
           </w:tcPr>
           <w:p>
             <w:pPr>
-              <w:spacing w:after="0" w:line="250"/>
+              <w:spacing w:after="0" w:line="220"/>
             </w:pPr>
             <w:r>
               <w:rPr>
@@ -4792,7 +5080,7 @@
                 <w:sz w:val="16"/>
                 <w:szCs w:val="16"/>
               </w:rPr>
-              <w:t xml:space="preserve">The surname sat in the operator's introduction; the question was asked by a colleague 'on for' him.</w:t>
+              <w:t xml:space="preserve">The surname sat in the operator's introduction. A colleague 'on for' him asked the question.</w:t>
             </w:r>
           </w:p>
         </w:tc>
@@ -4815,7 +5103,7 @@
           </w:tcPr>
           <w:p>
             <w:pPr>
-              <w:spacing w:after="0" w:line="250"/>
+              <w:spacing w:after="0" w:line="220"/>
             </w:pPr>
             <w:r>
               <w:rPr>
@@ -4849,7 +5137,7 @@
           </w:tcPr>
           <w:p>
             <w:pPr>
-              <w:spacing w:after="0" w:line="250"/>
+              <w:spacing w:after="0" w:line="220"/>
             </w:pPr>
             <w:r>
               <w:rPr>
@@ -4888,7 +5176,7 @@
           </w:tcPr>
           <w:p>
             <w:pPr>
-              <w:spacing w:after="0" w:line="250"/>
+              <w:spacing w:after="0" w:line="220"/>
             </w:pPr>
             <w:r>
               <w:rPr>
@@ -4922,7 +5210,7 @@
           </w:tcPr>
           <w:p>
             <w:pPr>
-              <w:spacing w:after="0" w:line="250"/>
+              <w:spacing w:after="0" w:line="220"/>
             </w:pPr>
             <w:r>
               <w:rPr>
@@ -4956,7 +5244,7 @@
           </w:tcPr>
           <w:p>
             <w:pPr>
-              <w:spacing w:after="0" w:line="250"/>
+              <w:spacing w:after="0" w:line="220"/>
             </w:pPr>
             <w:r>
               <w:rPr>
@@ -4990,7 +5278,7 @@
           </w:tcPr>
           <w:p>
             <w:pPr>
-              <w:spacing w:after="0" w:line="250"/>
+              <w:spacing w:after="0" w:line="220"/>
             </w:pPr>
             <w:r>
               <w:rPr>
@@ -5029,7 +5317,7 @@
           </w:tcPr>
           <w:p>
             <w:pPr>
-              <w:spacing w:after="0" w:line="250"/>
+              <w:spacing w:after="0" w:line="220"/>
             </w:pPr>
             <w:r>
               <w:rPr>
@@ -5063,7 +5351,7 @@
           </w:tcPr>
           <w:p>
             <w:pPr>
-              <w:spacing w:after="0" w:line="250"/>
+              <w:spacing w:after="0" w:line="220"/>
             </w:pPr>
             <w:r>
               <w:rPr>
@@ -5074,7 +5362,7 @@
                 <w:sz w:val="16"/>
                 <w:szCs w:val="16"/>
               </w:rPr>
-              <w:t xml:space="preserve">Ids used Python's hash(), which is salted per process; joins across the league, the app and DECIDE broke silently.</w:t>
+              <w:t xml:space="preserve">Ids used Python's hash(), which is salted per process. Joins across the league, the app and DECIDE broke silently.</w:t>
             </w:r>
           </w:p>
         </w:tc>
@@ -5097,7 +5385,7 @@
           </w:tcPr>
           <w:p>
             <w:pPr>
-              <w:spacing w:after="0" w:line="250"/>
+              <w:spacing w:after="0" w:line="220"/>
             </w:pPr>
             <w:r>
               <w:rPr>
@@ -5131,7 +5419,7 @@
           </w:tcPr>
           <w:p>
             <w:pPr>
-              <w:spacing w:after="0" w:line="250"/>
+              <w:spacing w:after="0" w:line="220"/>
             </w:pPr>
             <w:r>
               <w:rPr>
@@ -5170,7 +5458,7 @@
           </w:tcPr>
           <w:p>
             <w:pPr>
-              <w:spacing w:after="0" w:line="250"/>
+              <w:spacing w:after="0" w:line="220"/>
             </w:pPr>
             <w:r>
               <w:rPr>
@@ -5204,7 +5492,7 @@
           </w:tcPr>
           <w:p>
             <w:pPr>
-              <w:spacing w:after="0" w:line="250"/>
+              <w:spacing w:after="0" w:line="220"/>
             </w:pPr>
             <w:r>
               <w:rPr>
@@ -5238,7 +5526,7 @@
           </w:tcPr>
           <w:p>
             <w:pPr>
-              <w:spacing w:after="0" w:line="250"/>
+              <w:spacing w:after="0" w:line="220"/>
             </w:pPr>
             <w:r>
               <w:rPr>
@@ -5272,7 +5560,7 @@
           </w:tcPr>
           <w:p>
             <w:pPr>
-              <w:spacing w:after="0" w:line="250"/>
+              <w:spacing w:after="0" w:line="220"/>
             </w:pPr>
             <w:r>
               <w:rPr>
@@ -5311,7 +5599,7 @@
           </w:tcPr>
           <w:p>
             <w:pPr>
-              <w:spacing w:after="0" w:line="250"/>
+              <w:spacing w:after="0" w:line="220"/>
             </w:pPr>
             <w:r>
               <w:rPr>
@@ -5322,7 +5610,7 @@
                 <w:sz w:val="16"/>
                 <w:szCs w:val="16"/>
               </w:rPr>
-              <w:t xml:space="preserve">The Amgen Sharpest Needle rationale: 'the only surviving ruling both skeptics held through both rounds'.</w:t>
+              <w:t xml:space="preserve">The Amgen Sharpest Needle rationale read 'the only surviving ruling both skeptics held through both rounds'.</w:t>
             </w:r>
           </w:p>
         </w:tc>
@@ -5345,7 +5633,7 @@
           </w:tcPr>
           <w:p>
             <w:pPr>
-              <w:spacing w:after="0" w:line="250"/>
+              <w:spacing w:after="0" w:line="220"/>
             </w:pPr>
             <w:r>
               <w:rPr>
@@ -5379,7 +5667,7 @@
           </w:tcPr>
           <w:p>
             <w:pPr>
-              <w:spacing w:after="0" w:line="250"/>
+              <w:spacing w:after="0" w:line="220"/>
             </w:pPr>
             <w:r>
               <w:rPr>
@@ -5413,7 +5701,7 @@
           </w:tcPr>
           <w:p>
             <w:pPr>
-              <w:spacing w:after="0" w:line="250"/>
+              <w:spacing w:after="0" w:line="220"/>
             </w:pPr>
             <w:r>
               <w:rPr>
@@ -5452,7 +5740,7 @@
           </w:tcPr>
           <w:p>
             <w:pPr>
-              <w:spacing w:after="0" w:line="250"/>
+              <w:spacing w:after="0" w:line="220"/>
             </w:pPr>
             <w:r>
               <w:rPr>
@@ -5486,7 +5774,7 @@
           </w:tcPr>
           <w:p>
             <w:pPr>
-              <w:spacing w:after="0" w:line="250"/>
+              <w:spacing w:after="0" w:line="220"/>
             </w:pPr>
             <w:r>
               <w:rPr>
@@ -5520,7 +5808,7 @@
           </w:tcPr>
           <w:p>
             <w:pPr>
-              <w:spacing w:after="0" w:line="250"/>
+              <w:spacing w:after="0" w:line="220"/>
             </w:pPr>
             <w:r>
               <w:rPr>
@@ -5554,7 +5842,7 @@
           </w:tcPr>
           <w:p>
             <w:pPr>
-              <w:spacing w:after="0" w:line="250"/>
+              <w:spacing w:after="0" w:line="220"/>
             </w:pPr>
             <w:r>
               <w:rPr>
@@ -5593,7 +5881,7 @@
           </w:tcPr>
           <w:p>
             <w:pPr>
-              <w:spacing w:after="0" w:line="250"/>
+              <w:spacing w:after="0" w:line="220"/>
             </w:pPr>
             <w:r>
               <w:rPr>
@@ -5627,7 +5915,7 @@
           </w:tcPr>
           <w:p>
             <w:pPr>
-              <w:spacing w:after="0" w:line="250"/>
+              <w:spacing w:after="0" w:line="220"/>
             </w:pPr>
             <w:r>
               <w:rPr>
@@ -5661,7 +5949,7 @@
           </w:tcPr>
           <w:p>
             <w:pPr>
-              <w:spacing w:after="0" w:line="250"/>
+              <w:spacing w:after="0" w:line="220"/>
             </w:pPr>
             <w:r>
               <w:rPr>
@@ -5695,7 +5983,7 @@
           </w:tcPr>
           <w:p>
             <w:pPr>
-              <w:spacing w:after="0" w:line="250"/>
+              <w:spacing w:after="0" w:line="220"/>
             </w:pPr>
             <w:r>
               <w:rPr>
@@ -5734,7 +6022,7 @@
           </w:tcPr>
           <w:p>
             <w:pPr>
-              <w:spacing w:after="0" w:line="250"/>
+              <w:spacing w:after="0" w:line="220"/>
             </w:pPr>
             <w:r>
               <w:rPr>
@@ -5745,7 +6033,7 @@
                 <w:sz w:val="16"/>
                 <w:szCs w:val="16"/>
               </w:rPr>
-              <w:t xml:space="preserve">A $100 billion market forecast recorded as an upfront deal payment; a takeover target's market cap 50 times too high from pricing ordinary shares at the ADS rate.</w:t>
+              <w:t xml:space="preserve">A $100 billion market forecast recorded as an upfront deal payment, and a takeover target's market cap 50 times too high from pricing ordinary shares at the ADS rate.</w:t>
             </w:r>
           </w:p>
         </w:tc>
@@ -5768,7 +6056,7 @@
           </w:tcPr>
           <w:p>
             <w:pPr>
-              <w:spacing w:after="0" w:line="250"/>
+              <w:spacing w:after="0" w:line="220"/>
             </w:pPr>
             <w:r>
               <w:rPr>
@@ -5802,7 +6090,7 @@
           </w:tcPr>
           <w:p>
             <w:pPr>
-              <w:spacing w:after="0" w:line="250"/>
+              <w:spacing w:after="0" w:line="220"/>
             </w:pPr>
             <w:r>
               <w:rPr>
@@ -5836,7 +6124,7 @@
           </w:tcPr>
           <w:p>
             <w:pPr>
-              <w:spacing w:after="0" w:line="250"/>
+              <w:spacing w:after="0" w:line="220"/>
             </w:pPr>
             <w:r>
               <w:rPr>
@@ -5884,7 +6172,7 @@
           <w:left w:val="single" w:color="D97757" w:sz="18" w:space="12"/>
         </w:pBdr>
         <w:spacing w:after="200"/>
-        <w:ind w:left="360"/>
+        <w:ind w:left="360" w:right="720"/>
       </w:pPr>
       <w:r>
         <w:rPr>
@@ -5907,7 +6195,7 @@
           <w:sz w:val="21"/>
           <w:szCs w:val="21"/>
         </w:rPr>
-        <w:t xml:space="preserve">Two patterns run through the list. The AI was most confidently wrong where a number was plausible and the story around it was real: Lilly's margins are high and its obesity franchise is strong, so a $68B impact did not look absurd. And the checks that caught the worst cases were not the clever ones. A person reading a footnote, a colleague reading the other skeptic's file, a fresh agent told to assume everything is wrong: these found what the gate, the tests and the ratios could not.</w:t>
+        <w:t xml:space="preserve">Two patterns run through the list. The AI was most confidently wrong where a number was plausible and the story around it was real. Lilly's margins are high and its obesity franchise is strong, so a $68B impact did not look absurd. The checks that caught the worst cases were the plain ones. A person reading a footnote, a colleague reading the other skeptic's file and a fresh agent told to assume everything is wrong found what the gate, the tests and the ratios missed.</w:t>
       </w:r>
     </w:p>
     <w:p>
@@ -5952,7 +6240,7 @@
           <w:sz w:val="21"/>
           <w:szCs w:val="21"/>
         </w:rPr>
-        <w:t xml:space="preserve">The scoring model ran for a day on numbers nothing had verified, and the first gate was wrong too. Verification is the product; everything else is a view over it.</w:t>
+        <w:t xml:space="preserve">The scoring model ran for a day on numbers nothing had verified, and the first gate was wrong too. Every other part of the system depends on the verification being right.</w:t>
       </w:r>
     </w:p>
     <w:p>
@@ -5982,7 +6270,7 @@
           <w:sz w:val="21"/>
           <w:szCs w:val="21"/>
         </w:rPr>
-        <w:t xml:space="preserve">with code ratios as corroboration and not the other way round. The blind pass we ran Saturday night is the process we should have started with Saturday morning.</w:t>
+        <w:t xml:space="preserve">and use code ratios only to corroborate them. The blind pass we ran Saturday night is the process we should have started with Saturday morning.</w:t>
       </w:r>
     </w:p>
     <w:p>
@@ -6012,7 +6300,7 @@
           <w:sz w:val="21"/>
           <w:szCs w:val="21"/>
         </w:rPr>
-        <w:t xml:space="preserve">We built a larger model than the case needed and spent part of the weekend defending it. The findings table, the needle, the product comparison, one move and this report are the whole job.</w:t>
+        <w:t xml:space="preserve">We built a larger model than the case needed and spent part of the weekend defending it. The findings table, the needle, the product comparison, one move and this report are everything the case asks for.</w:t>
       </w:r>
     </w:p>
     <w:p>
@@ -6042,7 +6330,7 @@
           <w:sz w:val="21"/>
           <w:szCs w:val="21"/>
         </w:rPr>
-        <w:t xml:space="preserve">Two long sessions became unusable overnight when their requests began failing; the work continued only because the briefs, the launch prompts and the state lived in the repository, not in a context window.</w:t>
+        <w:t xml:space="preserve">Two long sessions became unusable overnight when their requests began failing. The work continued only because the briefs, the launch prompts and the state were on disk in the repository.</w:t>
       </w:r>
     </w:p>
     <w:p>
@@ -6102,7 +6390,7 @@
           <w:sz w:val="21"/>
           <w:szCs w:val="21"/>
         </w:rPr>
-        <w:t xml:space="preserve">Generic instructions produced generic verdicts. Lifting the specific figures, comparables and deciders from the candidates file into each prompt is what made round two sharp.</w:t>
+        <w:t xml:space="preserve">Generic instructions produced generic verdicts. Lifting the specific figures, comparables and deciders from the candidates file into each prompt made round two sharp.</w:t>
       </w:r>
     </w:p>
     <w:p>
@@ -6162,7 +6450,7 @@
           <w:sz w:val="21"/>
           <w:szCs w:val="21"/>
         </w:rPr>
-        <w:t xml:space="preserve">The planned one-pass model track, with citations on every block and the courtroom trial, stayed a plan; every sentence in the demo is deterministic. That is honest, but a checked model track would have been better.</w:t>
+        <w:t xml:space="preserve">The planned one-pass model track, with citations on every block and the courtroom trial, stayed a plan. Every sentence in the demo is deterministic. That is honest, but a checked model track would have been better.</w:t>
       </w:r>
     </w:p>
     <w:p>
@@ -6192,7 +6480,7 @@
           <w:sz w:val="21"/>
           <w:szCs w:val="21"/>
         </w:rPr>
-        <w:t xml:space="preserve">The host machine slept mid-run once and parallel workers collided on a shared folder once; both are avoidable.</w:t>
+        <w:t xml:space="preserve">The host machine slept mid-run once, and parallel workers collided on a shared folder once. Both are avoidable.</w:t>
       </w:r>
     </w:p>
     <w:p>
@@ -6221,7 +6509,7 @@
           <w:sz w:val="21"/>
           <w:szCs w:val="21"/>
         </w:rPr>
-        <w:t xml:space="preserve">Some things the system cannot see, and we say so rather than estimate. No product-level net price is public, so we never claim one; our policy and patent math covers the U.S. only, because filings give ex-U.S. revenue but not units or price; formulary and rebate contracts are private; analyst consensus is licensed and feeds the math but is never displayed; CMS Part D claims are annual to data year 2024; most Q3 2026 results land after judging, so the numbers run through Q2 2026. Every footnote opens the source document, but the page-highlight viewer runs only on our machines; public footnotes give the file page, the printed page and the document link.</w:t>
+        <w:t xml:space="preserve">Some things the system cannot see. Where that is so, we say so and do not estimate. No product-level net price is public, so we never claim one. Our policy and patent math covers the U.S. only, because filings give ex-U.S. revenue but not units or price. Formulary and rebate contracts are private. Analyst consensus is licensed, so it feeds the math and is never displayed. CMS Part D claims are annual to data year 2024. Most Q3 2026 results land after judging, so the numbers run through Q2 2026. Every footnote opens the source document, but the page-highlight viewer runs only on our machines. Public footnotes give the file page, the printed page and the document link.</w:t>
       </w:r>
     </w:p>
     <w:p>
@@ -6235,7 +6523,7 @@
           <w:sz w:val="21"/>
           <w:szCs w:val="21"/>
         </w:rPr>
-        <w:t xml:space="preserve">Everything is in one repository. The data branch holds the collectors, the index builder and the verified tables; the model branch holds the gate, the two pipelines and their outputs; the UI branch holds the exporters and the chat. The two skills, fine-print-part1 and fine-print-part2, carry each brief byte for byte and the launch and resume messages per role. A new company enters with one command that builds its filings, labels, calls and tables into the same index with stable ids; we proved it on three companies that were not in the case.</w:t>
+        <w:t xml:space="preserve">Everything is in one repository. The data branch holds the collectors, the index builder and the verified tables. The model branch holds the gate, the two pipelines and their outputs. The UI branch holds the exporters and the chat. The two skills, fine-print-part1 and fine-print-part2, carry each brief byte for byte and the launch and resume messages per role. A new company enters with one command that builds its filings, labels, calls and tables into the same index with stable ids. We proved this on three companies that were not in the case.</w:t>
       </w:r>
     </w:p>
     <w:p>
@@ -6263,7 +6551,7 @@
     <w:sectPr>
       <w:footerReference w:type="default" r:id="rId6"/>
       <w:pgSz w:w="12240" w:h="15840" w:orient="portrait"/>
-      <w:pgMar w:top="1296" w:right="1296" w:bottom="1200" w:left="1296" w:header="708" w:footer="708" w:gutter="0"/>
+      <w:pgMar w:top="1296" w:right="1296" w:bottom="1296" w:left="1296" w:header="708" w:footer="700" w:gutter="0"/>
       <w:pgNumType/>
       <w:docGrid w:linePitch="360"/>
     </w:sectPr>

</xml_diff>